<commit_message>
chore: reformat CV, change source format
</commit_message>
<xml_diff>
--- a/src/cv.docx
+++ b/src/cv.docx
@@ -24,41 +24,114 @@
     </w:p>
     <w:p>
       <w:pPr>
+        <w:rPr/>
+      </w:pPr>
+      <w:r>
         <w:rPr>
           <w:b w:val="1"/>
           <w:bCs w:val="1"/>
           <w:sz w:val="28"/>
           <w:szCs w:val="28"/>
-        </w:rPr>
-      </w:pPr>
-      <w:r>
-        <w:rPr>
-          <w:b w:val="1"/>
-          <w:bCs w:val="1"/>
-          <w:sz w:val="28"/>
-          <w:szCs w:val="28"/>
           <w:rtl w:val="0"/>
         </w:rPr>
         <w:t xml:space="preserve">DevOps/MLOps Engineer</w:t>
       </w:r>
       <w:r>
-        <w:pict>
-          <v:rect style="width:0.0pt;height:1.5pt" o:hr="t" o:hrstd="t" o:hralign="center" fillcolor="#A0A0A0" stroked="f"/>
-        </w:pict>
-      </w:r>
-      <w:r>
-        <w:rPr>
-          <w:rtl w:val="0"/>
-        </w:rPr>
-      </w:r>
-    </w:p>
-    <w:p>
-      <w:pPr>
-        <w:spacing w:after="240" w:line="276" w:lineRule="auto"/>
-        <w:rPr>
-          <w:color w:val="1155cc"/>
-          <w:u w:val="single"/>
-        </w:rPr>
+        <w:rPr/>
+        <mc:AlternateContent>
+          <mc:Choice Requires="wpg">
+            <w:drawing>
+              <wp:inline distB="0" distT="0" distL="114300" distR="114300">
+                <wp:extent cx="12700" cy="19685"/>
+                <wp:effectExtent b="0" l="0" r="0" t="0"/>
+                <wp:docPr id="2" name=""/>
+                <a:graphic>
+                  <a:graphicData uri="http://schemas.microsoft.com/office/word/2010/wordprocessingShape">
+                    <wps:wsp>
+                      <wps:cNvSpPr/>
+                      <wps:cNvPr id="3" name="Shape 3"/>
+                      <wps:spPr>
+                        <a:xfrm>
+                          <a:off x="5345640" y="3770460"/>
+                          <a:ext cx="720" cy="19080"/>
+                        </a:xfrm>
+                        <a:prstGeom prst="rect">
+                          <a:avLst/>
+                        </a:prstGeom>
+                        <a:solidFill>
+                          <a:srgbClr val="A0A0A0"/>
+                        </a:solidFill>
+                        <a:ln>
+                          <a:noFill/>
+                        </a:ln>
+                      </wps:spPr>
+                      <wps:txbx>
+                        <w:txbxContent>
+                          <w:p>
+                            <w:pPr>
+                              <w:spacing w:after="0" w:before="0" w:line="240"/>
+                              <w:ind w:left="0" w:right="0" w:firstLine="0"/>
+                              <w:jc w:val="left"/>
+                              <w:textDirection w:val="btLr"/>
+                            </w:pPr>
+                          </w:p>
+                        </w:txbxContent>
+                      </wps:txbx>
+                      <wps:bodyPr anchorCtr="0" anchor="ctr" bIns="91425" lIns="91425" spcFirstLastPara="1" rIns="91425" wrap="square" tIns="91425">
+                        <a:noAutofit/>
+                      </wps:bodyPr>
+                    </wps:wsp>
+                  </a:graphicData>
+                </a:graphic>
+              </wp:inline>
+            </w:drawing>
+          </mc:Choice>
+          <mc:Fallback>
+            <w:drawing>
+              <wp:inline distB="0" distT="0" distL="114300" distR="114300">
+                <wp:extent cx="12700" cy="19685"/>
+                <wp:effectExtent b="0" l="0" r="0" t="0"/>
+                <wp:docPr id="2" name="image2.png"/>
+                <a:graphic>
+                  <a:graphicData uri="http://schemas.openxmlformats.org/drawingml/2006/picture">
+                    <pic:pic>
+                      <pic:nvPicPr>
+                        <pic:cNvPr id="0" name="image2.png"/>
+                        <pic:cNvPicPr preferRelativeResize="0"/>
+                      </pic:nvPicPr>
+                      <pic:blipFill>
+                        <a:blip r:embed="rId6"/>
+                        <a:srcRect/>
+                        <a:stretch>
+                          <a:fillRect/>
+                        </a:stretch>
+                      </pic:blipFill>
+                      <pic:spPr>
+                        <a:xfrm>
+                          <a:off x="0" y="0"/>
+                          <a:ext cx="12700" cy="19685"/>
+                        </a:xfrm>
+                        <a:prstGeom prst="rect"/>
+                        <a:ln/>
+                      </pic:spPr>
+                    </pic:pic>
+                  </a:graphicData>
+                </a:graphic>
+              </wp:inline>
+            </w:drawing>
+          </mc:Fallback>
+        </mc:AlternateContent>
+      </w:r>
+      <w:r>
+        <w:rPr>
+          <w:rtl w:val="0"/>
+        </w:rPr>
+      </w:r>
+    </w:p>
+    <w:p>
+      <w:pPr>
+        <w:spacing w:after="240" w:before="0" w:line="276" w:lineRule="auto"/>
+        <w:rPr/>
       </w:pPr>
       <w:r>
         <w:rPr>
@@ -66,7 +139,7 @@
         </w:rPr>
         <w:t xml:space="preserve">📍 Belgrade, Serbia | 📞 +381 621 924 980 | ✉ bugreev.anton@gmail.com  | 💬</w:t>
       </w:r>
-      <w:hyperlink r:id="rId6">
+      <w:hyperlink r:id="rId7">
         <w:r>
           <w:rPr>
             <w:rtl w:val="0"/>
@@ -74,7 +147,7 @@
           <w:t xml:space="preserve"> </w:t>
         </w:r>
       </w:hyperlink>
-      <w:hyperlink r:id="rId7">
+      <w:hyperlink r:id="rId8">
         <w:r>
           <w:rPr>
             <w:color w:val="1155cc"/>
@@ -98,7 +171,7 @@
         </w:rPr>
         <w:t xml:space="preserve"> | 💻</w:t>
       </w:r>
-      <w:hyperlink r:id="rId8">
+      <w:hyperlink r:id="rId9">
         <w:r>
           <w:rPr>
             <w:rtl w:val="0"/>
@@ -106,7 +179,7 @@
           <w:t xml:space="preserve"> </w:t>
         </w:r>
       </w:hyperlink>
-      <w:hyperlink r:id="rId9">
+      <w:hyperlink r:id="rId10">
         <w:r>
           <w:rPr>
             <w:color w:val="1155cc"/>
@@ -130,7 +203,7 @@
         </w:rPr>
         <w:t xml:space="preserve"> | 🔗</w:t>
       </w:r>
-      <w:hyperlink r:id="rId10">
+      <w:hyperlink r:id="rId11">
         <w:r>
           <w:rPr>
             <w:rtl w:val="0"/>
@@ -138,7 +211,7 @@
           <w:t xml:space="preserve"> </w:t>
         </w:r>
       </w:hyperlink>
-      <w:hyperlink r:id="rId11">
+      <w:hyperlink r:id="rId12">
         <w:r>
           <w:rPr>
             <w:color w:val="1155cc"/>
@@ -156,10 +229,15 @@
         </w:rPr>
         <w:t xml:space="preserve"> </w:t>
       </w:r>
-    </w:p>
-    <w:p>
-      <w:pPr>
-        <w:spacing w:after="240" w:line="276" w:lineRule="auto"/>
+      <w:r>
+        <w:rPr>
+          <w:rtl w:val="0"/>
+        </w:rPr>
+      </w:r>
+    </w:p>
+    <w:p>
+      <w:pPr>
+        <w:spacing w:after="240" w:before="0" w:line="276" w:lineRule="auto"/>
         <w:rPr>
           <w:color w:val="1155cc"/>
           <w:u w:val="single"/>
@@ -187,50 +265,107 @@
         <w:t xml:space="preserve">ABOUT</w:t>
       </w:r>
       <w:r>
-        <w:pict>
-          <v:rect style="width:0.0pt;height:1.5pt" o:hr="t" o:hrstd="t" o:hralign="center" fillcolor="#A0A0A0" stroked="f"/>
-        </w:pict>
-      </w:r>
-      <w:r>
-        <w:rPr>
-          <w:rtl w:val="0"/>
-        </w:rPr>
-      </w:r>
-    </w:p>
-    <w:p>
-      <w:pPr>
-        <w:jc w:val="both"/>
-        <w:rPr/>
-      </w:pPr>
-      <w:r>
-        <w:rPr>
-          <w:rtl w:val="0"/>
-        </w:rPr>
-        <w:t xml:space="preserve">DevOps/MLOps engineer with 10+ years of experience designing, automating, and scaling infrastructure for machine learning platforms and mission‑critical workloads. Expert in </w:t>
-      </w:r>
-      <w:r>
-        <w:rPr>
-          <w:rtl w:val="0"/>
-        </w:rPr>
-        <w:t xml:space="preserve">Kubernetes (AWS EKS)</w:t>
-      </w:r>
-      <w:r>
-        <w:rPr>
-          <w:rtl w:val="0"/>
-        </w:rPr>
-        <w:t xml:space="preserve"> migrations, </w:t>
-      </w:r>
-      <w:r>
-        <w:rPr>
-          <w:rtl w:val="0"/>
-        </w:rPr>
-        <w:t xml:space="preserve">cloud cost optimization</w:t>
-      </w:r>
-      <w:r>
-        <w:rPr>
-          <w:rtl w:val="0"/>
-        </w:rPr>
-        <w:t xml:space="preserve">, and performance tuning for large‑scale ML inference. Proven ability to accelerate deployments, improve operational reliability, and enable data science teams to deliver models efficiently from experimentation to production.</w:t>
+        <w:rPr/>
+        <mc:AlternateContent>
+          <mc:Choice Requires="wpg">
+            <w:drawing>
+              <wp:inline distB="0" distT="0" distL="114300" distR="114300">
+                <wp:extent cx="12700" cy="19685"/>
+                <wp:effectExtent b="0" l="0" r="0" t="0"/>
+                <wp:docPr id="1" name=""/>
+                <a:graphic>
+                  <a:graphicData uri="http://schemas.microsoft.com/office/word/2010/wordprocessingShape">
+                    <wps:wsp>
+                      <wps:cNvSpPr/>
+                      <wps:cNvPr id="2" name="Shape 2"/>
+                      <wps:spPr>
+                        <a:xfrm>
+                          <a:off x="5345640" y="3770460"/>
+                          <a:ext cx="720" cy="19080"/>
+                        </a:xfrm>
+                        <a:prstGeom prst="rect">
+                          <a:avLst/>
+                        </a:prstGeom>
+                        <a:solidFill>
+                          <a:srgbClr val="A0A0A0"/>
+                        </a:solidFill>
+                        <a:ln>
+                          <a:noFill/>
+                        </a:ln>
+                      </wps:spPr>
+                      <wps:txbx>
+                        <w:txbxContent>
+                          <w:p>
+                            <w:pPr>
+                              <w:spacing w:after="0" w:before="0" w:line="240"/>
+                              <w:ind w:left="0" w:right="0" w:firstLine="0"/>
+                              <w:jc w:val="left"/>
+                              <w:textDirection w:val="btLr"/>
+                            </w:pPr>
+                          </w:p>
+                        </w:txbxContent>
+                      </wps:txbx>
+                      <wps:bodyPr anchorCtr="0" anchor="ctr" bIns="91425" lIns="91425" spcFirstLastPara="1" rIns="91425" wrap="square" tIns="91425">
+                        <a:noAutofit/>
+                      </wps:bodyPr>
+                    </wps:wsp>
+                  </a:graphicData>
+                </a:graphic>
+              </wp:inline>
+            </w:drawing>
+          </mc:Choice>
+          <mc:Fallback>
+            <w:drawing>
+              <wp:inline distB="0" distT="0" distL="114300" distR="114300">
+                <wp:extent cx="12700" cy="19685"/>
+                <wp:effectExtent b="0" l="0" r="0" t="0"/>
+                <wp:docPr id="1" name="image1.png"/>
+                <a:graphic>
+                  <a:graphicData uri="http://schemas.openxmlformats.org/drawingml/2006/picture">
+                    <pic:pic>
+                      <pic:nvPicPr>
+                        <pic:cNvPr id="0" name="image1.png"/>
+                        <pic:cNvPicPr preferRelativeResize="0"/>
+                      </pic:nvPicPr>
+                      <pic:blipFill>
+                        <a:blip r:embed="rId6"/>
+                        <a:srcRect/>
+                        <a:stretch>
+                          <a:fillRect/>
+                        </a:stretch>
+                      </pic:blipFill>
+                      <pic:spPr>
+                        <a:xfrm>
+                          <a:off x="0" y="0"/>
+                          <a:ext cx="12700" cy="19685"/>
+                        </a:xfrm>
+                        <a:prstGeom prst="rect"/>
+                        <a:ln/>
+                      </pic:spPr>
+                    </pic:pic>
+                  </a:graphicData>
+                </a:graphic>
+              </wp:inline>
+            </w:drawing>
+          </mc:Fallback>
+        </mc:AlternateContent>
+      </w:r>
+      <w:r>
+        <w:rPr>
+          <w:rtl w:val="0"/>
+        </w:rPr>
+      </w:r>
+    </w:p>
+    <w:p>
+      <w:pPr>
+        <w:jc w:val="both"/>
+        <w:rPr/>
+      </w:pPr>
+      <w:r>
+        <w:rPr>
+          <w:rtl w:val="0"/>
+        </w:rPr>
+        <w:t xml:space="preserve">DevOps/MLOps engineer with 10+ years of experience designing, automating, and scaling infrastructure for machine learning platforms and mission-critical workloads. Expert in Kubernetes (AWS EKS) migrations, cloud cost optimization, and performance tuning for large-scale ML inference. Proven ability to accelerate deployments, improve operational reliability, and enable data science teams to deliver models efficiently from experimentation to production.</w:t>
       </w:r>
     </w:p>
     <w:p>
@@ -259,9 +394,90 @@
         <w:t xml:space="preserve">TECHNOLOGIES AND TOOLS</w:t>
       </w:r>
       <w:r>
-        <w:pict>
-          <v:rect style="width:0.0pt;height:1.5pt" o:hr="t" o:hrstd="t" o:hralign="center" fillcolor="#A0A0A0" stroked="f"/>
-        </w:pict>
+        <w:rPr/>
+        <mc:AlternateContent>
+          <mc:Choice Requires="wpg">
+            <w:drawing>
+              <wp:inline distB="0" distT="0" distL="114300" distR="114300">
+                <wp:extent cx="12700" cy="19685"/>
+                <wp:effectExtent b="0" l="0" r="0" t="0"/>
+                <wp:docPr id="4" name=""/>
+                <a:graphic>
+                  <a:graphicData uri="http://schemas.microsoft.com/office/word/2010/wordprocessingShape">
+                    <wps:wsp>
+                      <wps:cNvSpPr/>
+                      <wps:cNvPr id="5" name="Shape 5"/>
+                      <wps:spPr>
+                        <a:xfrm>
+                          <a:off x="5345640" y="3770460"/>
+                          <a:ext cx="720" cy="19080"/>
+                        </a:xfrm>
+                        <a:prstGeom prst="rect">
+                          <a:avLst/>
+                        </a:prstGeom>
+                        <a:solidFill>
+                          <a:srgbClr val="A0A0A0"/>
+                        </a:solidFill>
+                        <a:ln>
+                          <a:noFill/>
+                        </a:ln>
+                      </wps:spPr>
+                      <wps:txbx>
+                        <w:txbxContent>
+                          <w:p>
+                            <w:pPr>
+                              <w:spacing w:after="0" w:before="0" w:line="240"/>
+                              <w:ind w:left="0" w:right="0" w:firstLine="0"/>
+                              <w:jc w:val="left"/>
+                              <w:textDirection w:val="btLr"/>
+                            </w:pPr>
+                          </w:p>
+                        </w:txbxContent>
+                      </wps:txbx>
+                      <wps:bodyPr anchorCtr="0" anchor="ctr" bIns="91425" lIns="91425" spcFirstLastPara="1" rIns="91425" wrap="square" tIns="91425">
+                        <a:noAutofit/>
+                      </wps:bodyPr>
+                    </wps:wsp>
+                  </a:graphicData>
+                </a:graphic>
+              </wp:inline>
+            </w:drawing>
+          </mc:Choice>
+          <mc:Fallback>
+            <w:drawing>
+              <wp:inline distB="0" distT="0" distL="114300" distR="114300">
+                <wp:extent cx="12700" cy="19685"/>
+                <wp:effectExtent b="0" l="0" r="0" t="0"/>
+                <wp:docPr id="4" name="image4.png"/>
+                <a:graphic>
+                  <a:graphicData uri="http://schemas.openxmlformats.org/drawingml/2006/picture">
+                    <pic:pic>
+                      <pic:nvPicPr>
+                        <pic:cNvPr id="0" name="image4.png"/>
+                        <pic:cNvPicPr preferRelativeResize="0"/>
+                      </pic:nvPicPr>
+                      <pic:blipFill>
+                        <a:blip r:embed="rId6"/>
+                        <a:srcRect/>
+                        <a:stretch>
+                          <a:fillRect/>
+                        </a:stretch>
+                      </pic:blipFill>
+                      <pic:spPr>
+                        <a:xfrm>
+                          <a:off x="0" y="0"/>
+                          <a:ext cx="12700" cy="19685"/>
+                        </a:xfrm>
+                        <a:prstGeom prst="rect"/>
+                        <a:ln/>
+                      </pic:spPr>
+                    </pic:pic>
+                  </a:graphicData>
+                </a:graphic>
+              </wp:inline>
+            </w:drawing>
+          </mc:Fallback>
+        </mc:AlternateContent>
       </w:r>
       <w:r>
         <w:rPr>
@@ -275,8 +491,9 @@
           <w:ilvl w:val="0"/>
           <w:numId w:val="3"/>
         </w:numPr>
-        <w:spacing w:after="0" w:afterAutospacing="0" w:before="240" w:lineRule="auto"/>
-        <w:ind w:left="720" w:hanging="360"/>
+        <w:spacing w:after="0" w:before="240" w:line="240" w:lineRule="auto"/>
+        <w:ind w:left="720" w:right="0" w:hanging="360"/>
+        <w:rPr/>
       </w:pPr>
       <w:r>
         <w:rPr>
@@ -299,8 +516,9 @@
           <w:ilvl w:val="0"/>
           <w:numId w:val="3"/>
         </w:numPr>
-        <w:spacing w:after="0" w:afterAutospacing="0" w:before="0" w:beforeAutospacing="0" w:lineRule="auto"/>
-        <w:ind w:left="720" w:hanging="360"/>
+        <w:spacing w:after="0" w:before="0" w:line="240" w:lineRule="auto"/>
+        <w:ind w:left="720" w:right="0" w:hanging="360"/>
+        <w:rPr/>
       </w:pPr>
       <w:r>
         <w:rPr>
@@ -323,8 +541,9 @@
           <w:ilvl w:val="0"/>
           <w:numId w:val="3"/>
         </w:numPr>
-        <w:spacing w:after="0" w:afterAutospacing="0" w:before="0" w:beforeAutospacing="0" w:lineRule="auto"/>
-        <w:ind w:left="720" w:hanging="360"/>
+        <w:spacing w:after="0" w:before="0" w:line="240" w:lineRule="auto"/>
+        <w:ind w:left="720" w:right="0" w:hanging="360"/>
+        <w:rPr/>
       </w:pPr>
       <w:r>
         <w:rPr>
@@ -347,8 +566,9 @@
           <w:ilvl w:val="0"/>
           <w:numId w:val="3"/>
         </w:numPr>
-        <w:spacing w:after="0" w:afterAutospacing="0" w:before="0" w:beforeAutospacing="0" w:lineRule="auto"/>
-        <w:ind w:left="720" w:hanging="360"/>
+        <w:spacing w:after="0" w:before="0" w:line="240" w:lineRule="auto"/>
+        <w:ind w:left="720" w:right="0" w:hanging="360"/>
+        <w:rPr/>
       </w:pPr>
       <w:r>
         <w:rPr>
@@ -371,8 +591,9 @@
           <w:ilvl w:val="0"/>
           <w:numId w:val="3"/>
         </w:numPr>
-        <w:spacing w:after="0" w:afterAutospacing="0" w:before="0" w:beforeAutospacing="0" w:lineRule="auto"/>
-        <w:ind w:left="720" w:hanging="360"/>
+        <w:spacing w:after="0" w:before="0" w:line="240" w:lineRule="auto"/>
+        <w:ind w:left="720" w:right="0" w:hanging="360"/>
+        <w:rPr/>
       </w:pPr>
       <w:r>
         <w:rPr>
@@ -395,8 +616,9 @@
           <w:ilvl w:val="0"/>
           <w:numId w:val="3"/>
         </w:numPr>
-        <w:spacing w:after="0" w:afterAutospacing="0" w:before="0" w:beforeAutospacing="0" w:lineRule="auto"/>
-        <w:ind w:left="720" w:hanging="360"/>
+        <w:spacing w:after="0" w:before="0" w:line="240" w:lineRule="auto"/>
+        <w:ind w:left="720" w:right="0" w:hanging="360"/>
+        <w:rPr/>
       </w:pPr>
       <w:r>
         <w:rPr>
@@ -419,8 +641,9 @@
           <w:ilvl w:val="0"/>
           <w:numId w:val="3"/>
         </w:numPr>
-        <w:spacing w:after="0" w:afterAutospacing="0" w:before="0" w:beforeAutospacing="0" w:lineRule="auto"/>
-        <w:ind w:left="720" w:hanging="360"/>
+        <w:spacing w:after="0" w:before="0" w:line="240" w:lineRule="auto"/>
+        <w:ind w:left="720" w:right="0" w:hanging="360"/>
+        <w:rPr/>
       </w:pPr>
       <w:r>
         <w:rPr>
@@ -443,8 +666,9 @@
           <w:ilvl w:val="0"/>
           <w:numId w:val="3"/>
         </w:numPr>
-        <w:spacing w:after="0" w:afterAutospacing="0" w:before="0" w:beforeAutospacing="0" w:lineRule="auto"/>
-        <w:ind w:left="720" w:hanging="360"/>
+        <w:spacing w:after="0" w:before="0" w:line="240" w:lineRule="auto"/>
+        <w:ind w:left="720" w:right="0" w:hanging="360"/>
+        <w:rPr/>
       </w:pPr>
       <w:r>
         <w:rPr>
@@ -467,8 +691,9 @@
           <w:ilvl w:val="0"/>
           <w:numId w:val="3"/>
         </w:numPr>
-        <w:spacing w:after="0" w:afterAutospacing="0" w:before="0" w:beforeAutospacing="0" w:lineRule="auto"/>
-        <w:ind w:left="720" w:hanging="360"/>
+        <w:spacing w:after="0" w:before="0" w:line="240" w:lineRule="auto"/>
+        <w:ind w:left="720" w:right="0" w:hanging="360"/>
+        <w:rPr/>
       </w:pPr>
       <w:r>
         <w:rPr>
@@ -491,8 +716,9 @@
           <w:ilvl w:val="0"/>
           <w:numId w:val="3"/>
         </w:numPr>
-        <w:spacing w:after="0" w:afterAutospacing="0" w:before="0" w:beforeAutospacing="0" w:lineRule="auto"/>
-        <w:ind w:left="720" w:hanging="360"/>
+        <w:spacing w:after="0" w:before="0" w:line="240" w:lineRule="auto"/>
+        <w:ind w:left="720" w:right="0" w:hanging="360"/>
+        <w:rPr/>
       </w:pPr>
       <w:r>
         <w:rPr>
@@ -515,8 +741,9 @@
           <w:ilvl w:val="0"/>
           <w:numId w:val="3"/>
         </w:numPr>
-        <w:spacing w:after="0" w:afterAutospacing="0" w:before="0" w:beforeAutospacing="0" w:lineRule="auto"/>
-        <w:ind w:left="720" w:hanging="360"/>
+        <w:spacing w:after="0" w:before="0" w:line="240" w:lineRule="auto"/>
+        <w:ind w:left="720" w:right="0" w:hanging="360"/>
+        <w:rPr/>
       </w:pPr>
       <w:r>
         <w:rPr>
@@ -530,7 +757,7 @@
         <w:rPr>
           <w:rtl w:val="0"/>
         </w:rPr>
-        <w:t xml:space="preserve"> Prisma Cloud, Snyk, Wallarm</w:t>
+        <w:t xml:space="preserve"> Prisma Cloud, Snyk, Wallarm (HIPAA compliance)</w:t>
       </w:r>
     </w:p>
     <w:p>
@@ -539,11 +766,9 @@
           <w:ilvl w:val="0"/>
           <w:numId w:val="3"/>
         </w:numPr>
-        <w:spacing w:after="240" w:before="0" w:beforeAutospacing="0" w:lineRule="auto"/>
-        <w:ind w:left="720" w:hanging="360"/>
-        <w:rPr>
-          <w:u w:val="none"/>
-        </w:rPr>
+        <w:spacing w:after="240" w:before="0" w:line="240" w:lineRule="auto"/>
+        <w:ind w:left="720" w:right="0" w:hanging="360"/>
+        <w:rPr/>
       </w:pPr>
       <w:r>
         <w:rPr>
@@ -562,18 +787,7 @@
     </w:p>
     <w:p>
       <w:pPr>
-        <w:spacing w:after="240" w:before="240" w:lineRule="auto"/>
-        <w:rPr/>
-      </w:pPr>
-      <w:r>
-        <w:rPr>
-          <w:rtl w:val="0"/>
-        </w:rPr>
-      </w:r>
-    </w:p>
-    <w:p>
-      <w:pPr>
-        <w:spacing w:after="240" w:before="240" w:lineRule="auto"/>
+        <w:spacing w:after="240" w:before="240" w:line="240" w:lineRule="auto"/>
         <w:rPr/>
       </w:pPr>
       <w:r>
@@ -597,9 +811,90 @@
         <w:t xml:space="preserve">WORK EXPERIENCE</w:t>
       </w:r>
       <w:r>
-        <w:pict>
-          <v:rect style="width:0.0pt;height:1.5pt" o:hr="t" o:hrstd="t" o:hralign="center" fillcolor="#A0A0A0" stroked="f"/>
-        </w:pict>
+        <w:rPr/>
+        <mc:AlternateContent>
+          <mc:Choice Requires="wpg">
+            <w:drawing>
+              <wp:inline distB="0" distT="0" distL="114300" distR="114300">
+                <wp:extent cx="12700" cy="19685"/>
+                <wp:effectExtent b="0" l="0" r="0" t="0"/>
+                <wp:docPr id="3" name=""/>
+                <a:graphic>
+                  <a:graphicData uri="http://schemas.microsoft.com/office/word/2010/wordprocessingShape">
+                    <wps:wsp>
+                      <wps:cNvSpPr/>
+                      <wps:cNvPr id="4" name="Shape 4"/>
+                      <wps:spPr>
+                        <a:xfrm>
+                          <a:off x="5345640" y="3770460"/>
+                          <a:ext cx="720" cy="19080"/>
+                        </a:xfrm>
+                        <a:prstGeom prst="rect">
+                          <a:avLst/>
+                        </a:prstGeom>
+                        <a:solidFill>
+                          <a:srgbClr val="A0A0A0"/>
+                        </a:solidFill>
+                        <a:ln>
+                          <a:noFill/>
+                        </a:ln>
+                      </wps:spPr>
+                      <wps:txbx>
+                        <w:txbxContent>
+                          <w:p>
+                            <w:pPr>
+                              <w:spacing w:after="0" w:before="0" w:line="240"/>
+                              <w:ind w:left="0" w:right="0" w:firstLine="0"/>
+                              <w:jc w:val="left"/>
+                              <w:textDirection w:val="btLr"/>
+                            </w:pPr>
+                          </w:p>
+                        </w:txbxContent>
+                      </wps:txbx>
+                      <wps:bodyPr anchorCtr="0" anchor="ctr" bIns="91425" lIns="91425" spcFirstLastPara="1" rIns="91425" wrap="square" tIns="91425">
+                        <a:noAutofit/>
+                      </wps:bodyPr>
+                    </wps:wsp>
+                  </a:graphicData>
+                </a:graphic>
+              </wp:inline>
+            </w:drawing>
+          </mc:Choice>
+          <mc:Fallback>
+            <w:drawing>
+              <wp:inline distB="0" distT="0" distL="114300" distR="114300">
+                <wp:extent cx="12700" cy="19685"/>
+                <wp:effectExtent b="0" l="0" r="0" t="0"/>
+                <wp:docPr id="3" name="image3.png"/>
+                <a:graphic>
+                  <a:graphicData uri="http://schemas.openxmlformats.org/drawingml/2006/picture">
+                    <pic:pic>
+                      <pic:nvPicPr>
+                        <pic:cNvPr id="0" name="image3.png"/>
+                        <pic:cNvPicPr preferRelativeResize="0"/>
+                      </pic:nvPicPr>
+                      <pic:blipFill>
+                        <a:blip r:embed="rId6"/>
+                        <a:srcRect/>
+                        <a:stretch>
+                          <a:fillRect/>
+                        </a:stretch>
+                      </pic:blipFill>
+                      <pic:spPr>
+                        <a:xfrm>
+                          <a:off x="0" y="0"/>
+                          <a:ext cx="12700" cy="19685"/>
+                        </a:xfrm>
+                        <a:prstGeom prst="rect"/>
+                        <a:ln/>
+                      </pic:spPr>
+                    </pic:pic>
+                  </a:graphicData>
+                </a:graphic>
+              </wp:inline>
+            </w:drawing>
+          </mc:Fallback>
+        </mc:AlternateContent>
       </w:r>
       <w:r>
         <w:rPr>
@@ -622,282 +917,185 @@
           <w:color w:val="000000"/>
           <w:rtl w:val="0"/>
         </w:rPr>
-        <w:t xml:space="preserve">Contract </w:t>
-      </w:r>
-      <w:r>
+        <w:t xml:space="preserve">Contract DevOps/MLOps Engineer</w:t>
+      </w:r>
+    </w:p>
+    <w:p>
+      <w:pPr>
+        <w:jc w:val="both"/>
+        <w:rPr/>
+      </w:pPr>
+      <w:r>
+        <w:rPr>
+          <w:rtl w:val="0"/>
+        </w:rPr>
+        <w:t xml:space="preserve">Belgrade, Serbia · 2022–Present</w:t>
+      </w:r>
+    </w:p>
+    <w:p>
+      <w:pPr>
+        <w:numPr>
+          <w:ilvl w:val="0"/>
+          <w:numId w:val="3"/>
+        </w:numPr>
+        <w:spacing w:after="0" w:before="240" w:line="240" w:lineRule="auto"/>
+        <w:ind w:left="720" w:right="0" w:hanging="360"/>
+        <w:rPr/>
+      </w:pPr>
+      <w:r>
+        <w:rPr>
+          <w:rtl w:val="0"/>
+        </w:rPr>
+        <w:t xml:space="preserve">Migrated complex AI/ML infrastructure (Kubeflow Pipelines, JupyterHub, custom applications) from legacy environments to AWS EKS on the company’s modern platform, reducing infrastructure costs and enhancing failover recovery capabilities.</w:t>
+      </w:r>
+    </w:p>
+    <w:p>
+      <w:pPr>
+        <w:numPr>
+          <w:ilvl w:val="0"/>
+          <w:numId w:val="3"/>
+        </w:numPr>
+        <w:spacing w:after="0" w:before="0" w:line="240" w:lineRule="auto"/>
+        <w:ind w:left="720" w:right="0" w:hanging="360"/>
+        <w:rPr/>
+      </w:pPr>
+      <w:r>
+        <w:rPr>
+          <w:rtl w:val="0"/>
+        </w:rPr>
+        <w:t xml:space="preserve">Integrated and tuned Karpenter autoscaling in production ML workloads, ensuring rapid burst capacity during high-volume inference and improving resource utilization efficiency.</w:t>
+      </w:r>
+    </w:p>
+    <w:p>
+      <w:pPr>
+        <w:numPr>
+          <w:ilvl w:val="0"/>
+          <w:numId w:val="3"/>
+        </w:numPr>
+        <w:spacing w:after="0" w:before="0" w:line="240" w:lineRule="auto"/>
+        <w:ind w:left="720" w:right="0" w:hanging="360"/>
+        <w:rPr/>
+      </w:pPr>
+      <w:r>
+        <w:rPr>
+          <w:rtl w:val="0"/>
+        </w:rPr>
+        <w:t xml:space="preserve">Developed Terraform IaC modules for automated provisioning of AI infrastructure in AWS, standardizing environments and reducing deployment setup time across teams.</w:t>
+      </w:r>
+    </w:p>
+    <w:p>
+      <w:pPr>
+        <w:numPr>
+          <w:ilvl w:val="0"/>
+          <w:numId w:val="3"/>
+        </w:numPr>
+        <w:spacing w:after="0" w:before="0" w:line="240" w:lineRule="auto"/>
+        <w:ind w:left="720" w:right="0" w:hanging="360"/>
+        <w:rPr/>
+      </w:pPr>
+      <w:r>
+        <w:rPr>
+          <w:rtl w:val="0"/>
+        </w:rPr>
+        <w:t xml:space="preserve">Migrated vector search databases from Vespa to OpenSearch; ran embedding model evaluations to select and deploy a solution that improved vector search accuracy by &gt;15% for critical datasets.</w:t>
+      </w:r>
+    </w:p>
+    <w:p>
+      <w:pPr>
+        <w:numPr>
+          <w:ilvl w:val="0"/>
+          <w:numId w:val="3"/>
+        </w:numPr>
+        <w:spacing w:after="0" w:before="0" w:line="240" w:lineRule="auto"/>
+        <w:ind w:left="720" w:right="0" w:hanging="360"/>
+        <w:rPr/>
+      </w:pPr>
+      <w:r>
+        <w:rPr>
+          <w:rtl w:val="0"/>
+        </w:rPr>
+        <w:t xml:space="preserve">Automated Argo Workflows for retrieval-augmented generation (RAG) tasks, embedding generation, schema population, k6 load testing, and batch ingestion pipelines, resulting in higher reliability and faster data processing cycles.</w:t>
+      </w:r>
+    </w:p>
+    <w:p>
+      <w:pPr>
+        <w:numPr>
+          <w:ilvl w:val="0"/>
+          <w:numId w:val="3"/>
+        </w:numPr>
+        <w:spacing w:after="0" w:before="0" w:line="240" w:lineRule="auto"/>
+        <w:ind w:left="720" w:right="0" w:hanging="360"/>
+        <w:rPr/>
+      </w:pPr>
+      <w:r>
+        <w:rPr>
+          <w:rtl w:val="0"/>
+        </w:rPr>
+        <w:t xml:space="preserve">Deployed and managed Langfuse ML engineering platform for centralized prompt management; added LLM API request/response tracing to accelerate debugging and model iteration cycles.</w:t>
+      </w:r>
+    </w:p>
+    <w:p>
+      <w:pPr>
+        <w:numPr>
+          <w:ilvl w:val="0"/>
+          <w:numId w:val="3"/>
+        </w:numPr>
+        <w:spacing w:after="0" w:before="0" w:line="240" w:lineRule="auto"/>
+        <w:ind w:left="720" w:right="0" w:hanging="360"/>
+        <w:rPr/>
+      </w:pPr>
+      <w:r>
+        <w:rPr>
+          <w:rtl w:val="0"/>
+        </w:rPr>
+        <w:t xml:space="preserve">Contributed to OpenWebUI + LiteLLM + Model Context Protocol (MCP) component development, authoring system prompts and integrating AWS cost insights, GitHub, New Relic, and Prometheus, expanding operational visibility and intelligence for engineering teams.</w:t>
+      </w:r>
+    </w:p>
+    <w:p>
+      <w:pPr>
+        <w:numPr>
+          <w:ilvl w:val="0"/>
+          <w:numId w:val="3"/>
+        </w:numPr>
+        <w:spacing w:after="240" w:before="0" w:line="240" w:lineRule="auto"/>
+        <w:ind w:left="720" w:right="0" w:hanging="360"/>
+        <w:rPr/>
+      </w:pPr>
+      <w:r>
+        <w:rPr>
+          <w:rtl w:val="0"/>
+        </w:rPr>
+        <w:t xml:space="preserve">Wrote runbooks, incident playbooks, and operational guidelines, improving on-call response efficiency and MTTR for production incidents.</w:t>
+      </w:r>
+    </w:p>
+    <w:p>
+      <w:pPr>
+        <w:spacing w:after="240" w:before="0" w:line="240" w:lineRule="auto"/>
+        <w:rPr/>
+      </w:pPr>
+      <w:r>
+        <w:rPr>
+          <w:rtl w:val="0"/>
+        </w:rPr>
+      </w:r>
+    </w:p>
+    <w:p>
+      <w:pPr>
+        <w:pStyle w:val="Heading2"/>
+        <w:jc w:val="both"/>
         <w:rPr>
           <w:rFonts w:ascii="Cambria" w:cs="Cambria" w:eastAsia="Cambria" w:hAnsi="Cambria"/>
           <w:color w:val="000000"/>
-          <w:rtl w:val="0"/>
-        </w:rPr>
-        <w:t xml:space="preserve">DevOps</w:t>
-      </w:r>
+        </w:rPr>
+      </w:pPr>
       <w:r>
         <w:rPr>
           <w:rFonts w:ascii="Cambria" w:cs="Cambria" w:eastAsia="Cambria" w:hAnsi="Cambria"/>
           <w:color w:val="000000"/>
           <w:rtl w:val="0"/>
         </w:rPr>
-        <w:t xml:space="preserve">/MLOps</w:t>
-      </w:r>
-      <w:r>
-        <w:rPr>
-          <w:rFonts w:ascii="Cambria" w:cs="Cambria" w:eastAsia="Cambria" w:hAnsi="Cambria"/>
-          <w:color w:val="000000"/>
-          <w:rtl w:val="0"/>
-        </w:rPr>
-        <w:t xml:space="preserve"> Engineer</w:t>
-      </w:r>
-      <w:r>
-        <w:rPr>
-          <w:rtl w:val="0"/>
-        </w:rPr>
-      </w:r>
-    </w:p>
-    <w:p>
-      <w:pPr>
-        <w:jc w:val="both"/>
-        <w:rPr/>
-      </w:pPr>
-      <w:r>
-        <w:rPr>
-          <w:rtl w:val="0"/>
-        </w:rPr>
-        <w:t xml:space="preserve">Belgrade, Serbia · 2022–Present</w:t>
-      </w:r>
-      <w:r>
-        <w:rPr>
-          <w:rtl w:val="0"/>
-        </w:rPr>
-      </w:r>
-    </w:p>
-    <w:p>
-      <w:pPr>
-        <w:numPr>
-          <w:ilvl w:val="0"/>
-          <w:numId w:val="3"/>
-        </w:numPr>
-        <w:spacing w:after="0" w:afterAutospacing="0" w:before="240" w:lineRule="auto"/>
-        <w:ind w:left="720" w:hanging="360"/>
-      </w:pPr>
-      <w:r>
-        <w:rPr>
-          <w:rtl w:val="0"/>
-        </w:rPr>
-        <w:t xml:space="preserve">Migrated complex AI/ML infrastructure (Kubeflow Pipelines, JupyterHub, custom applications) from legacy environments to AWS EKS on the company’s modern platform, reducing infrastructure costs and enhancing failover recovery capabilities.</w:t>
-      </w:r>
-    </w:p>
-    <w:p>
-      <w:pPr>
-        <w:numPr>
-          <w:ilvl w:val="0"/>
-          <w:numId w:val="3"/>
-        </w:numPr>
-        <w:spacing w:after="0" w:afterAutospacing="0" w:lineRule="auto"/>
-        <w:ind w:left="720" w:hanging="360"/>
-      </w:pPr>
-      <w:r>
-        <w:rPr>
-          <w:rtl w:val="0"/>
-        </w:rPr>
-        <w:t xml:space="preserve">Integrated and tuned Karpenter autoscaling in production ML workloads, ensuring rapid burst capacity during high‑volume inference and improving resource utilization efficiency.</w:t>
-      </w:r>
-    </w:p>
-    <w:p>
-      <w:pPr>
-        <w:numPr>
-          <w:ilvl w:val="0"/>
-          <w:numId w:val="3"/>
-        </w:numPr>
-        <w:spacing w:after="0" w:afterAutospacing="0" w:lineRule="auto"/>
-        <w:ind w:left="720" w:hanging="360"/>
-      </w:pPr>
-      <w:r>
-        <w:rPr>
-          <w:rtl w:val="0"/>
-        </w:rPr>
-        <w:t xml:space="preserve">Developed Terraform IaC modules for automated provisioning of AI infrastructure in AWS, </w:t>
-      </w:r>
-      <w:r>
-        <w:rPr>
-          <w:rtl w:val="0"/>
-        </w:rPr>
-        <w:t xml:space="preserve">standardizing environments</w:t>
-      </w:r>
-      <w:r>
-        <w:rPr>
-          <w:rtl w:val="0"/>
-        </w:rPr>
-        <w:t xml:space="preserve"> and reducing deployment setup time across teams.</w:t>
-      </w:r>
-      <w:r>
-        <w:rPr>
-          <w:rtl w:val="0"/>
-        </w:rPr>
-      </w:r>
-    </w:p>
-    <w:p>
-      <w:pPr>
-        <w:numPr>
-          <w:ilvl w:val="0"/>
-          <w:numId w:val="3"/>
-        </w:numPr>
-        <w:spacing w:after="0" w:afterAutospacing="0" w:before="0" w:beforeAutospacing="0" w:lineRule="auto"/>
-        <w:ind w:left="720" w:hanging="360"/>
-        <w:rPr>
-          <w:u w:val="none"/>
-        </w:rPr>
-      </w:pPr>
-      <w:r>
-        <w:rPr>
-          <w:rtl w:val="0"/>
-        </w:rPr>
-        <w:t xml:space="preserve">Migrated vector search databases from Vespa to OpenSearch; ran embedding model evaluations to select and deploy a solution that</w:t>
-      </w:r>
-      <w:r>
-        <w:rPr>
-          <w:rtl w:val="0"/>
-        </w:rPr>
-        <w:t xml:space="preserve"> improved vector search accuracy by &gt;15%</w:t>
-      </w:r>
-      <w:r>
-        <w:rPr>
-          <w:rtl w:val="0"/>
-        </w:rPr>
-        <w:t xml:space="preserve"> for critical datasets.</w:t>
-      </w:r>
-    </w:p>
-    <w:p>
-      <w:pPr>
-        <w:numPr>
-          <w:ilvl w:val="0"/>
-          <w:numId w:val="3"/>
-        </w:numPr>
-        <w:spacing w:after="0" w:afterAutospacing="0" w:before="0" w:beforeAutospacing="0" w:lineRule="auto"/>
-        <w:ind w:left="720" w:hanging="360"/>
-        <w:rPr>
-          <w:u w:val="none"/>
-        </w:rPr>
-      </w:pPr>
-      <w:r>
-        <w:rPr>
-          <w:rtl w:val="0"/>
-        </w:rPr>
-        <w:t xml:space="preserve">Automated Argo Workflows for retrieval‑augmented generation (RAG) tasks, embedding generation, schema population, k6 load testing, and batch ingestion pipelines, resulting in</w:t>
-      </w:r>
-      <w:r>
-        <w:rPr>
-          <w:rtl w:val="0"/>
-        </w:rPr>
-        <w:t xml:space="preserve"> higher reliability and faster data processing cycles.</w:t>
-      </w:r>
-      <w:r>
-        <w:rPr>
-          <w:rtl w:val="0"/>
-        </w:rPr>
-      </w:r>
-    </w:p>
-    <w:p>
-      <w:pPr>
-        <w:numPr>
-          <w:ilvl w:val="0"/>
-          <w:numId w:val="3"/>
-        </w:numPr>
-        <w:spacing w:after="0" w:afterAutospacing="0" w:before="0" w:beforeAutospacing="0" w:lineRule="auto"/>
-        <w:ind w:left="720" w:hanging="360"/>
-        <w:rPr>
-          <w:u w:val="none"/>
-        </w:rPr>
-      </w:pPr>
-      <w:r>
-        <w:rPr>
-          <w:rtl w:val="0"/>
-        </w:rPr>
-        <w:t xml:space="preserve">Deployed and managed Langfuse ML engineering platform for centralized prompt management; added LLM API request/response tracing to </w:t>
-      </w:r>
-      <w:r>
-        <w:rPr>
-          <w:rtl w:val="0"/>
-        </w:rPr>
-        <w:t xml:space="preserve">accelerate debugging and model iteration cycles.</w:t>
-      </w:r>
-      <w:r>
-        <w:rPr>
-          <w:rtl w:val="0"/>
-        </w:rPr>
-      </w:r>
-    </w:p>
-    <w:p>
-      <w:pPr>
-        <w:numPr>
-          <w:ilvl w:val="0"/>
-          <w:numId w:val="3"/>
-        </w:numPr>
-        <w:spacing w:after="0" w:afterAutospacing="0" w:before="0" w:beforeAutospacing="0" w:lineRule="auto"/>
-        <w:ind w:left="720" w:hanging="360"/>
-        <w:rPr>
-          <w:u w:val="none"/>
-        </w:rPr>
-      </w:pPr>
-      <w:r>
-        <w:rPr>
-          <w:rtl w:val="0"/>
-        </w:rPr>
-        <w:t xml:space="preserve">Contributed to OpenWebUI + LiteLLM + Model Context Protocol (MCP) component development, authoring system prompts and integrating AWS cost insights, GitHub, New Relic, and Prometheus, </w:t>
-      </w:r>
-      <w:r>
-        <w:rPr>
-          <w:rtl w:val="0"/>
-        </w:rPr>
-        <w:t xml:space="preserve">expanding operational visibility and intelligence for engineering teams.</w:t>
-      </w:r>
-    </w:p>
-    <w:p>
-      <w:pPr>
-        <w:numPr>
-          <w:ilvl w:val="0"/>
-          <w:numId w:val="3"/>
-        </w:numPr>
-        <w:spacing w:after="240" w:lineRule="auto"/>
-        <w:ind w:left="720" w:hanging="360"/>
-      </w:pPr>
-      <w:r>
-        <w:rPr>
-          <w:rtl w:val="0"/>
-        </w:rPr>
-        <w:t xml:space="preserve">Wrote runbooks, incident playbooks, and operational guidelines, improving on‑call response efficiency and MTTR for production incidents.</w:t>
-      </w:r>
-    </w:p>
-    <w:p>
-      <w:pPr>
-        <w:spacing w:after="240" w:lineRule="auto"/>
-        <w:rPr/>
-      </w:pPr>
-      <w:r>
-        <w:rPr>
-          <w:rtl w:val="0"/>
-        </w:rPr>
-      </w:r>
-    </w:p>
-    <w:p>
-      <w:pPr>
-        <w:pStyle w:val="Heading2"/>
-        <w:jc w:val="both"/>
-        <w:rPr/>
-      </w:pPr>
-      <w:r>
-        <w:rPr>
-          <w:rFonts w:ascii="Cambria" w:cs="Cambria" w:eastAsia="Cambria" w:hAnsi="Cambria"/>
-          <w:color w:val="000000"/>
-          <w:rtl w:val="0"/>
-        </w:rPr>
         <w:t xml:space="preserve">Quantumsoft - DevOps Engineer</w:t>
       </w:r>
-      <w:r>
-        <w:rPr>
-          <w:rtl w:val="0"/>
-        </w:rPr>
-      </w:r>
     </w:p>
     <w:p>
       <w:pPr>
@@ -915,131 +1113,11 @@
       <w:pPr>
         <w:spacing w:line="240" w:lineRule="auto"/>
         <w:jc w:val="both"/>
-        <w:rPr>
-          <w:sz w:val="24"/>
-          <w:szCs w:val="24"/>
-        </w:rPr>
-      </w:pPr>
-      <w:r>
         <w:rPr>
           <w:b w:val="1"/>
           <w:bCs w:val="1"/>
           <w:sz w:val="24"/>
           <w:szCs w:val="24"/>
-          <w:rtl w:val="0"/>
-        </w:rPr>
-        <w:t xml:space="preserve">AI/ML project (2020-2022)</w:t>
-      </w:r>
-      <w:r>
-        <w:rPr>
-          <w:rtl w:val="0"/>
-        </w:rPr>
-      </w:r>
-    </w:p>
-    <w:p>
-      <w:pPr>
-        <w:numPr>
-          <w:ilvl w:val="0"/>
-          <w:numId w:val="2"/>
-        </w:numPr>
-        <w:spacing w:after="0" w:afterAutospacing="0" w:lineRule="auto"/>
-        <w:ind w:left="720" w:hanging="360"/>
-        <w:rPr>
-          <w:u w:val="none"/>
-        </w:rPr>
-      </w:pPr>
-      <w:r>
-        <w:rPr>
-          <w:rtl w:val="0"/>
-        </w:rPr>
-        <w:t xml:space="preserve">Designed and operated multi‑cluster Kubernetes environments (Rancher v2) supporting </w:t>
-      </w:r>
-      <w:r>
-        <w:rPr>
-          <w:rtl w:val="0"/>
-        </w:rPr>
-        <w:t xml:space="preserve">50+ microservices</w:t>
-      </w:r>
-      <w:r>
-        <w:rPr>
-          <w:rtl w:val="0"/>
-        </w:rPr>
-        <w:t xml:space="preserve">, achieving </w:t>
-      </w:r>
-      <w:r>
-        <w:rPr>
-          <w:rtl w:val="0"/>
-        </w:rPr>
-        <w:t xml:space="preserve">99.9% production uptime,</w:t>
-      </w:r>
-      <w:r>
-        <w:rPr>
-          <w:rtl w:val="0"/>
-        </w:rPr>
-        <w:t xml:space="preserve"> and ensuring high‑availability for mission‑critical workloads. </w:t>
-      </w:r>
-    </w:p>
-    <w:p>
-      <w:pPr>
-        <w:numPr>
-          <w:ilvl w:val="0"/>
-          <w:numId w:val="2"/>
-        </w:numPr>
-        <w:spacing w:after="0" w:afterAutospacing="0" w:lineRule="auto"/>
-        <w:ind w:left="720" w:hanging="360"/>
-      </w:pPr>
-      <w:r>
-        <w:rPr>
-          <w:rtl w:val="0"/>
-        </w:rPr>
-        <w:t xml:space="preserve">Implemented scalable ML model serving with KServe, Knative, and KEDA; tuned autoscaling policies for performance efficiency.</w:t>
-      </w:r>
-      <w:r>
-        <w:rPr>
-          <w:rtl w:val="0"/>
-        </w:rPr>
-      </w:r>
-    </w:p>
-    <w:p>
-      <w:pPr>
-        <w:numPr>
-          <w:ilvl w:val="0"/>
-          <w:numId w:val="2"/>
-        </w:numPr>
-        <w:spacing w:after="0" w:afterAutospacing="0" w:before="0" w:beforeAutospacing="0" w:lineRule="auto"/>
-        <w:ind w:left="720" w:hanging="360"/>
-      </w:pPr>
-      <w:r>
-        <w:rPr>
-          <w:rtl w:val="0"/>
-        </w:rPr>
-        <w:t xml:space="preserve">Developed Terraform modules to standardize provisioning of RDS, S3, Elasticache, EFS, and autoscaling node groups, reducing environment setup time from days to under 1 hour.</w:t>
-      </w:r>
-    </w:p>
-    <w:p>
-      <w:pPr>
-        <w:numPr>
-          <w:ilvl w:val="0"/>
-          <w:numId w:val="2"/>
-        </w:numPr>
-        <w:spacing w:after="240" w:lineRule="auto"/>
-        <w:ind w:left="720" w:hanging="360"/>
-      </w:pPr>
-      <w:r>
-        <w:rPr>
-          <w:rtl w:val="0"/>
-        </w:rPr>
-        <w:t xml:space="preserve">Migrated CI/CD workflows from Jenkins to GitHub Actions, improving build speeds and deployment reliability.</w:t>
-      </w:r>
-    </w:p>
-    <w:p>
-      <w:pPr>
-        <w:spacing w:line="240" w:lineRule="auto"/>
-        <w:ind w:left="0" w:firstLine="0"/>
-        <w:jc w:val="both"/>
-        <w:rPr>
-          <w:sz w:val="24"/>
-          <w:szCs w:val="24"/>
         </w:rPr>
       </w:pPr>
       <w:r>
@@ -1050,13 +1128,99 @@
           <w:szCs w:val="24"/>
           <w:rtl w:val="0"/>
         </w:rPr>
+        <w:t xml:space="preserve">AI/ML project (2020-2022)</w:t>
+      </w:r>
+    </w:p>
+    <w:p>
+      <w:pPr>
+        <w:numPr>
+          <w:ilvl w:val="0"/>
+          <w:numId w:val="2"/>
+        </w:numPr>
+        <w:spacing w:after="0" w:before="0" w:line="240" w:lineRule="auto"/>
+        <w:ind w:left="720" w:right="0" w:hanging="360"/>
+        <w:rPr/>
+      </w:pPr>
+      <w:r>
+        <w:rPr>
+          <w:rtl w:val="0"/>
+        </w:rPr>
+        <w:t xml:space="preserve">Designed and operated multi-cluster Kubernetes environments (Rancher v2) supporting 50+ microservices, achieving 99.9% production uptime, and ensuring high-availability for mission-critical workloads. </w:t>
+      </w:r>
+    </w:p>
+    <w:p>
+      <w:pPr>
+        <w:numPr>
+          <w:ilvl w:val="0"/>
+          <w:numId w:val="2"/>
+        </w:numPr>
+        <w:spacing w:after="0" w:before="0" w:line="240" w:lineRule="auto"/>
+        <w:ind w:left="720" w:right="0" w:hanging="360"/>
+        <w:rPr/>
+      </w:pPr>
+      <w:r>
+        <w:rPr>
+          <w:rtl w:val="0"/>
+        </w:rPr>
+        <w:t xml:space="preserve">Implemented scalable ML model serving with KServe, Knative, and KEDA; tuned autoscaling policies for performance efficiency.</w:t>
+      </w:r>
+    </w:p>
+    <w:p>
+      <w:pPr>
+        <w:numPr>
+          <w:ilvl w:val="0"/>
+          <w:numId w:val="2"/>
+        </w:numPr>
+        <w:spacing w:after="0" w:before="0" w:line="240" w:lineRule="auto"/>
+        <w:ind w:left="720" w:right="0" w:hanging="360"/>
+        <w:rPr/>
+      </w:pPr>
+      <w:r>
+        <w:rPr>
+          <w:rtl w:val="0"/>
+        </w:rPr>
+        <w:t xml:space="preserve">Developed Terraform modules to standardize provisioning of RDS, S3, Elasticache, EFS, and autoscaling node groups, reducing environment setup time from days to under 1 hour.</w:t>
+      </w:r>
+    </w:p>
+    <w:p>
+      <w:pPr>
+        <w:numPr>
+          <w:ilvl w:val="0"/>
+          <w:numId w:val="2"/>
+        </w:numPr>
+        <w:spacing w:after="240" w:before="0" w:line="240" w:lineRule="auto"/>
+        <w:ind w:left="720" w:right="0" w:hanging="360"/>
+        <w:rPr/>
+      </w:pPr>
+      <w:r>
+        <w:rPr>
+          <w:rtl w:val="0"/>
+        </w:rPr>
+        <w:t xml:space="preserve">Migrated CI/CD workflows from Jenkins to GitHub Actions, improving build speeds and deployment reliability.</w:t>
+      </w:r>
+    </w:p>
+    <w:p>
+      <w:pPr>
+        <w:spacing w:line="240" w:lineRule="auto"/>
+        <w:ind w:left="0" w:right="0" w:firstLine="0"/>
+        <w:jc w:val="both"/>
+        <w:rPr>
+          <w:b w:val="1"/>
+          <w:bCs w:val="1"/>
+          <w:sz w:val="24"/>
+          <w:szCs w:val="24"/>
+        </w:rPr>
+      </w:pPr>
+      <w:r>
+        <w:rPr>
+          <w:b w:val="1"/>
+          <w:bCs w:val="1"/>
+          <w:sz w:val="24"/>
+          <w:szCs w:val="24"/>
+          <w:rtl w:val="0"/>
+        </w:rPr>
         <w:t xml:space="preserve">Web Project (2016-2020)</w:t>
       </w:r>
-      <w:r>
-        <w:rPr>
-          <w:rtl w:val="0"/>
-        </w:rPr>
-      </w:r>
     </w:p>
     <w:p>
       <w:pPr>
@@ -1064,18 +1228,16 @@
           <w:ilvl w:val="0"/>
           <w:numId w:val="1"/>
         </w:numPr>
-        <w:spacing w:after="0" w:afterAutospacing="0" w:line="240" w:lineRule="auto"/>
-        <w:ind w:left="720" w:hanging="360"/>
-        <w:jc w:val="both"/>
-        <w:rPr>
-          <w:u w:val="none"/>
-        </w:rPr>
-      </w:pPr>
-      <w:r>
-        <w:rPr>
-          <w:rtl w:val="0"/>
-        </w:rPr>
-        <w:t xml:space="preserve">Automated end‑to‑end build, test, and deployment workflows using Ansible, Bamboo, and Rancher v1, reducing release time from 4+ hours to under 30 minutes and introducing blue/green deployment strategies to minimize downtime and release risk. </w:t>
+        <w:spacing w:after="0" w:before="0" w:line="240" w:lineRule="auto"/>
+        <w:ind w:left="720" w:right="0" w:hanging="360"/>
+        <w:jc w:val="both"/>
+        <w:rPr/>
+      </w:pPr>
+      <w:r>
+        <w:rPr>
+          <w:rtl w:val="0"/>
+        </w:rPr>
+        <w:t xml:space="preserve">Automated end-to-end build, test, and deployment workflows using Ansible, Bamboo, and Rancher v1, reducing release time from 4+ hours to under 30 minutes and introducing blue/green deployment strategies to minimize downtime and release risk. </w:t>
       </w:r>
     </w:p>
     <w:p>
@@ -1084,15 +1246,16 @@
           <w:ilvl w:val="0"/>
           <w:numId w:val="1"/>
         </w:numPr>
-        <w:spacing w:after="0" w:afterAutospacing="0" w:line="240" w:lineRule="auto"/>
-        <w:ind w:left="720" w:hanging="360"/>
-        <w:jc w:val="both"/>
-      </w:pPr>
-      <w:r>
-        <w:rPr>
-          <w:rtl w:val="0"/>
-        </w:rPr>
-        <w:t xml:space="preserve">Refactored monolithic application architecture into containerized microservices; moved workloads from Docker Compose to Rancher‑managed orchestration, enhancing scalability and service isolation.</w:t>
+        <w:spacing w:after="0" w:before="0" w:line="240" w:lineRule="auto"/>
+        <w:ind w:left="720" w:right="0" w:hanging="360"/>
+        <w:jc w:val="both"/>
+        <w:rPr/>
+      </w:pPr>
+      <w:r>
+        <w:rPr>
+          <w:rtl w:val="0"/>
+        </w:rPr>
+        <w:t xml:space="preserve">Refactored monolithic application architecture into containerized microservices; moved workloads from Docker Compose to Rancher-managed orchestration, enhancing scalability and service isolation.</w:t>
       </w:r>
     </w:p>
     <w:p>
@@ -1101,12 +1264,10 @@
           <w:ilvl w:val="0"/>
           <w:numId w:val="1"/>
         </w:numPr>
-        <w:spacing w:after="0" w:afterAutospacing="0" w:line="240" w:lineRule="auto"/>
-        <w:ind w:left="720" w:hanging="360"/>
-        <w:jc w:val="both"/>
-        <w:rPr>
-          <w:u w:val="none"/>
-        </w:rPr>
+        <w:spacing w:after="0" w:before="0" w:line="240" w:lineRule="auto"/>
+        <w:ind w:left="720" w:right="0" w:hanging="360"/>
+        <w:jc w:val="both"/>
+        <w:rPr/>
       </w:pPr>
       <w:r>
         <w:rPr>
@@ -1114,11 +1275,6 @@
         </w:rPr>
         <w:t xml:space="preserve">Developed custom Ansible modules and playbooks for application builds and infrastructure provisioning, improving deployment consistency and reducing manual configuration errors. </w:t>
       </w:r>
-      <w:r>
-        <w:rPr>
-          <w:rtl w:val="0"/>
-        </w:rPr>
-      </w:r>
     </w:p>
     <w:p>
       <w:pPr>
@@ -1126,8 +1282,9 @@
           <w:ilvl w:val="0"/>
           <w:numId w:val="1"/>
         </w:numPr>
-        <w:spacing w:after="240" w:before="0" w:beforeAutospacing="0" w:lineRule="auto"/>
-        <w:ind w:left="720" w:hanging="360"/>
+        <w:spacing w:after="240" w:before="0" w:line="240" w:lineRule="auto"/>
+        <w:ind w:left="720" w:right="0" w:hanging="360"/>
+        <w:rPr/>
       </w:pPr>
       <w:r>
         <w:rPr>
@@ -1138,7 +1295,7 @@
     </w:p>
     <w:p>
       <w:pPr>
-        <w:spacing w:after="240" w:before="240" w:lineRule="auto"/>
+        <w:spacing w:after="240" w:before="240" w:line="240" w:lineRule="auto"/>
         <w:rPr/>
       </w:pPr>
       <w:r>
@@ -1151,117 +1308,32 @@
       <w:pPr>
         <w:pStyle w:val="Heading2"/>
         <w:jc w:val="both"/>
-        <w:rPr/>
-      </w:pPr>
-      <w:bookmarkStart w:colFirst="0" w:colLast="0" w:name="_7t6zx9hn3nav" w:id="0"/>
-      <w:bookmarkEnd w:id="0"/>
-      <w:r>
         <w:rPr>
           <w:rFonts w:ascii="Cambria" w:cs="Cambria" w:eastAsia="Cambria" w:hAnsi="Cambria"/>
           <w:color w:val="000000"/>
-          <w:rtl w:val="0"/>
-        </w:rPr>
-        <w:t xml:space="preserve">Online-media - Hosting System Administrator</w:t>
-      </w:r>
-      <w:r>
-        <w:rPr>
-          <w:rtl w:val="0"/>
-        </w:rPr>
-      </w:r>
-    </w:p>
-    <w:p>
-      <w:pPr>
-        <w:jc w:val="both"/>
-        <w:rPr/>
-      </w:pPr>
-      <w:r>
-        <w:rPr>
-          <w:rtl w:val="0"/>
-        </w:rPr>
-        <w:t xml:space="preserve">Tomsk, Russia · 2012–2016</w:t>
-      </w:r>
-    </w:p>
-    <w:p>
-      <w:pPr>
-        <w:numPr>
-          <w:ilvl w:val="0"/>
-          <w:numId w:val="4"/>
-        </w:numPr>
-        <w:spacing w:after="0" w:afterAutospacing="0" w:line="240" w:lineRule="auto"/>
-        <w:ind w:left="283.46456692913375" w:hanging="285"/>
-        <w:jc w:val="both"/>
-      </w:pPr>
-      <w:r>
-        <w:rPr>
-          <w:rtl w:val="0"/>
-        </w:rPr>
-        <w:t xml:space="preserve">Maintained Linux/FreeBSD servers</w:t>
-      </w:r>
-    </w:p>
-    <w:p>
-      <w:pPr>
-        <w:numPr>
-          <w:ilvl w:val="0"/>
-          <w:numId w:val="4"/>
-        </w:numPr>
-        <w:spacing w:line="240" w:lineRule="auto"/>
-        <w:ind w:left="283.46456692913375" w:hanging="285"/>
-        <w:jc w:val="both"/>
-        <w:rPr>
-          <w:u w:val="none"/>
-        </w:rPr>
-      </w:pPr>
-      <w:r>
-        <w:rPr>
-          <w:rtl w:val="0"/>
-        </w:rPr>
-        <w:t xml:space="preserve">Automated hosting setup with Ansible and Docker for local dev environments</w:t>
-      </w:r>
-    </w:p>
-    <w:p>
-      <w:pPr>
-        <w:spacing w:line="240" w:lineRule="auto"/>
-        <w:jc w:val="both"/>
-        <w:rPr/>
-      </w:pPr>
-      <w:r>
-        <w:rPr>
-          <w:rtl w:val="0"/>
-        </w:rPr>
-      </w:r>
-    </w:p>
-    <w:p>
-      <w:pPr>
-        <w:pStyle w:val="Heading2"/>
-        <w:jc w:val="both"/>
-        <w:rPr/>
-      </w:pPr>
-      <w:bookmarkStart w:colFirst="0" w:colLast="0" w:name="_21c28l62x5qk" w:id="1"/>
-      <w:bookmarkEnd w:id="1"/>
+        </w:rPr>
+      </w:pPr>
+      <w:bookmarkStart w:colFirst="0" w:colLast="0" w:name="_9npeygy2zx3d" w:id="0"/>
+      <w:bookmarkEnd w:id="0"/>
       <w:r>
         <w:rPr>
           <w:rFonts w:ascii="Cambria" w:cs="Cambria" w:eastAsia="Cambria" w:hAnsi="Cambria"/>
           <w:color w:val="000000"/>
           <w:rtl w:val="0"/>
         </w:rPr>
-        <w:t xml:space="preserve">WebMedia - Hosting System Administrator (part-time)</w:t>
-      </w:r>
-      <w:r>
-        <w:rPr>
-          <w:rtl w:val="0"/>
-        </w:rPr>
-      </w:r>
-    </w:p>
-    <w:p>
-      <w:pPr>
-        <w:jc w:val="both"/>
-        <w:rPr/>
-      </w:pPr>
-      <w:r>
-        <w:rPr>
-          <w:rtl w:val="0"/>
-        </w:rPr>
-        <w:t xml:space="preserve">Tomsk, Russia · 2009–2016</w:t>
+        <w:t xml:space="preserve">Online-media - Hosting System Administrator</w:t>
+      </w:r>
+    </w:p>
+    <w:p>
+      <w:pPr>
+        <w:jc w:val="both"/>
+        <w:rPr/>
+      </w:pPr>
+      <w:r>
+        <w:rPr>
+          <w:rtl w:val="0"/>
+        </w:rPr>
+        <w:t xml:space="preserve">Tomsk, Russia · 2012–2016</w:t>
       </w:r>
     </w:p>
     <w:p>
@@ -1270,15 +1342,16 @@
           <w:ilvl w:val="0"/>
           <w:numId w:val="4"/>
         </w:numPr>
-        <w:spacing w:after="0" w:afterAutospacing="0" w:line="240" w:lineRule="auto"/>
-        <w:ind w:left="283.46456692913375" w:hanging="285"/>
-        <w:jc w:val="both"/>
-      </w:pPr>
-      <w:r>
-        <w:rPr>
-          <w:rtl w:val="0"/>
-        </w:rPr>
-        <w:t xml:space="preserve">Maintained Linux/FreeBSD systems</w:t>
+        <w:spacing w:after="0" w:before="0" w:line="240" w:lineRule="auto"/>
+        <w:ind w:left="283" w:right="0" w:hanging="285"/>
+        <w:jc w:val="both"/>
+        <w:rPr/>
+      </w:pPr>
+      <w:r>
+        <w:rPr>
+          <w:rtl w:val="0"/>
+        </w:rPr>
+        <w:t xml:space="preserve">Maintained Linux/FreeBSD servers</w:t>
       </w:r>
     </w:p>
     <w:p>
@@ -1288,14 +1361,15 @@
           <w:numId w:val="4"/>
         </w:numPr>
         <w:spacing w:line="240" w:lineRule="auto"/>
-        <w:ind w:left="283.46456692913375" w:hanging="285"/>
-        <w:jc w:val="both"/>
-      </w:pPr>
-      <w:r>
-        <w:rPr>
-          <w:rtl w:val="0"/>
-        </w:rPr>
-        <w:t xml:space="preserve">Supported hosting and web/mail/vpn services</w:t>
+        <w:ind w:left="283" w:right="0" w:hanging="285"/>
+        <w:jc w:val="both"/>
+        <w:rPr/>
+      </w:pPr>
+      <w:r>
+        <w:rPr>
+          <w:rtl w:val="0"/>
+        </w:rPr>
+        <w:t xml:space="preserve">Automated hosting setup with Ansible and Docker for local dev environments</w:t>
       </w:r>
     </w:p>
     <w:p>
@@ -1314,23 +1388,101 @@
       <w:pPr>
         <w:pStyle w:val="Heading2"/>
         <w:jc w:val="both"/>
-        <w:rPr/>
-      </w:pPr>
-      <w:bookmarkStart w:colFirst="0" w:colLast="0" w:name="_1p0jkjlhlooz" w:id="2"/>
-      <w:bookmarkEnd w:id="2"/>
-      <w:r>
         <w:rPr>
           <w:rFonts w:ascii="Cambria" w:cs="Cambria" w:eastAsia="Cambria" w:hAnsi="Cambria"/>
           <w:color w:val="000000"/>
+        </w:rPr>
+      </w:pPr>
+      <w:bookmarkStart w:colFirst="0" w:colLast="0" w:name="_yyp46os9sw4r" w:id="1"/>
+      <w:bookmarkEnd w:id="1"/>
+      <w:r>
+        <w:rPr>
+          <w:rFonts w:ascii="Cambria" w:cs="Cambria" w:eastAsia="Cambria" w:hAnsi="Cambria"/>
+          <w:color w:val="000000"/>
+          <w:rtl w:val="0"/>
+        </w:rPr>
+        <w:t xml:space="preserve">WebMedia - Hosting System Administrator (part-time)</w:t>
+      </w:r>
+    </w:p>
+    <w:p>
+      <w:pPr>
+        <w:jc w:val="both"/>
+        <w:rPr/>
+      </w:pPr>
+      <w:r>
+        <w:rPr>
+          <w:rtl w:val="0"/>
+        </w:rPr>
+        <w:t xml:space="preserve">Tomsk, Russia · 2009–2016</w:t>
+      </w:r>
+    </w:p>
+    <w:p>
+      <w:pPr>
+        <w:numPr>
+          <w:ilvl w:val="0"/>
+          <w:numId w:val="4"/>
+        </w:numPr>
+        <w:spacing w:after="0" w:before="0" w:line="240" w:lineRule="auto"/>
+        <w:ind w:left="283" w:right="0" w:hanging="285"/>
+        <w:jc w:val="both"/>
+        <w:rPr/>
+      </w:pPr>
+      <w:r>
+        <w:rPr>
+          <w:rtl w:val="0"/>
+        </w:rPr>
+        <w:t xml:space="preserve">Maintained Linux/FreeBSD systems</w:t>
+      </w:r>
+    </w:p>
+    <w:p>
+      <w:pPr>
+        <w:numPr>
+          <w:ilvl w:val="0"/>
+          <w:numId w:val="4"/>
+        </w:numPr>
+        <w:spacing w:line="240" w:lineRule="auto"/>
+        <w:ind w:left="283" w:right="0" w:hanging="285"/>
+        <w:jc w:val="both"/>
+        <w:rPr/>
+      </w:pPr>
+      <w:r>
+        <w:rPr>
+          <w:rtl w:val="0"/>
+        </w:rPr>
+        <w:t xml:space="preserve">Supported hosting and web/mail/vpn services</w:t>
+      </w:r>
+    </w:p>
+    <w:p>
+      <w:pPr>
+        <w:spacing w:line="240" w:lineRule="auto"/>
+        <w:jc w:val="both"/>
+        <w:rPr/>
+      </w:pPr>
+      <w:r>
+        <w:rPr>
+          <w:rtl w:val="0"/>
+        </w:rPr>
+      </w:r>
+    </w:p>
+    <w:p>
+      <w:pPr>
+        <w:pStyle w:val="Heading2"/>
+        <w:jc w:val="both"/>
+        <w:rPr>
+          <w:rFonts w:ascii="Cambria" w:cs="Cambria" w:eastAsia="Cambria" w:hAnsi="Cambria"/>
+          <w:color w:val="000000"/>
+        </w:rPr>
+      </w:pPr>
+      <w:bookmarkStart w:colFirst="0" w:colLast="0" w:name="_ur24jncwafm2" w:id="2"/>
+      <w:bookmarkEnd w:id="2"/>
+      <w:r>
+        <w:rPr>
+          <w:rFonts w:ascii="Cambria" w:cs="Cambria" w:eastAsia="Cambria" w:hAnsi="Cambria"/>
+          <w:color w:val="000000"/>
           <w:rtl w:val="0"/>
         </w:rPr>
         <w:t xml:space="preserve">TOMTEL - Hosting System Administrator</w:t>
       </w:r>
-      <w:r>
-        <w:rPr>
-          <w:rtl w:val="0"/>
-        </w:rPr>
-      </w:r>
     </w:p>
     <w:p>
       <w:pPr>
@@ -1350,9 +1502,10 @@
           <w:ilvl w:val="0"/>
           <w:numId w:val="4"/>
         </w:numPr>
-        <w:spacing w:after="0" w:afterAutospacing="0" w:line="240" w:lineRule="auto"/>
-        <w:ind w:left="283.46456692913375" w:hanging="285"/>
-        <w:jc w:val="both"/>
+        <w:spacing w:after="0" w:before="0" w:line="240" w:lineRule="auto"/>
+        <w:ind w:left="283" w:right="0" w:hanging="285"/>
+        <w:jc w:val="both"/>
+        <w:rPr/>
       </w:pPr>
       <w:r>
         <w:rPr>
@@ -1368,8 +1521,9 @@
           <w:numId w:val="4"/>
         </w:numPr>
         <w:spacing w:line="240" w:lineRule="auto"/>
-        <w:ind w:left="283.46456692913375" w:hanging="285"/>
-        <w:jc w:val="both"/>
+        <w:ind w:left="283" w:right="0" w:hanging="285"/>
+        <w:jc w:val="both"/>
+        <w:rPr/>
       </w:pPr>
       <w:r>
         <w:rPr>
@@ -1381,20 +1535,7 @@
     <w:p>
       <w:pPr>
         <w:spacing w:line="240" w:lineRule="auto"/>
-        <w:ind w:left="0" w:firstLine="0"/>
-        <w:jc w:val="both"/>
-        <w:rPr/>
-      </w:pPr>
-      <w:r>
-        <w:rPr>
-          <w:rtl w:val="0"/>
-        </w:rPr>
-      </w:r>
-    </w:p>
-    <w:p>
-      <w:pPr>
-        <w:spacing w:line="240" w:lineRule="auto"/>
-        <w:ind w:left="0" w:firstLine="0"/>
+        <w:ind w:left="0" w:right="0" w:firstLine="0"/>
         <w:jc w:val="both"/>
         <w:rPr/>
       </w:pPr>
@@ -1420,9 +1561,90 @@
         <w:t xml:space="preserve">EDUCATION</w:t>
       </w:r>
       <w:r>
-        <w:pict>
-          <v:rect style="width:0.0pt;height:1.5pt" o:hr="t" o:hrstd="t" o:hralign="center" fillcolor="#A0A0A0" stroked="f"/>
-        </w:pict>
+        <w:rPr/>
+        <mc:AlternateContent>
+          <mc:Choice Requires="wpg">
+            <w:drawing>
+              <wp:inline distB="0" distT="0" distL="114300" distR="114300">
+                <wp:extent cx="12700" cy="19685"/>
+                <wp:effectExtent b="0" l="0" r="0" t="0"/>
+                <wp:docPr id="6" name=""/>
+                <a:graphic>
+                  <a:graphicData uri="http://schemas.microsoft.com/office/word/2010/wordprocessingShape">
+                    <wps:wsp>
+                      <wps:cNvSpPr/>
+                      <wps:cNvPr id="7" name="Shape 7"/>
+                      <wps:spPr>
+                        <a:xfrm>
+                          <a:off x="5345640" y="3770460"/>
+                          <a:ext cx="720" cy="19080"/>
+                        </a:xfrm>
+                        <a:prstGeom prst="rect">
+                          <a:avLst/>
+                        </a:prstGeom>
+                        <a:solidFill>
+                          <a:srgbClr val="A0A0A0"/>
+                        </a:solidFill>
+                        <a:ln>
+                          <a:noFill/>
+                        </a:ln>
+                      </wps:spPr>
+                      <wps:txbx>
+                        <w:txbxContent>
+                          <w:p>
+                            <w:pPr>
+                              <w:spacing w:after="0" w:before="0" w:line="240"/>
+                              <w:ind w:left="0" w:right="0" w:firstLine="0"/>
+                              <w:jc w:val="left"/>
+                              <w:textDirection w:val="btLr"/>
+                            </w:pPr>
+                          </w:p>
+                        </w:txbxContent>
+                      </wps:txbx>
+                      <wps:bodyPr anchorCtr="0" anchor="ctr" bIns="91425" lIns="91425" spcFirstLastPara="1" rIns="91425" wrap="square" tIns="91425">
+                        <a:noAutofit/>
+                      </wps:bodyPr>
+                    </wps:wsp>
+                  </a:graphicData>
+                </a:graphic>
+              </wp:inline>
+            </w:drawing>
+          </mc:Choice>
+          <mc:Fallback>
+            <w:drawing>
+              <wp:inline distB="0" distT="0" distL="114300" distR="114300">
+                <wp:extent cx="12700" cy="19685"/>
+                <wp:effectExtent b="0" l="0" r="0" t="0"/>
+                <wp:docPr id="6" name="image6.png"/>
+                <a:graphic>
+                  <a:graphicData uri="http://schemas.openxmlformats.org/drawingml/2006/picture">
+                    <pic:pic>
+                      <pic:nvPicPr>
+                        <pic:cNvPr id="0" name="image6.png"/>
+                        <pic:cNvPicPr preferRelativeResize="0"/>
+                      </pic:nvPicPr>
+                      <pic:blipFill>
+                        <a:blip r:embed="rId6"/>
+                        <a:srcRect/>
+                        <a:stretch>
+                          <a:fillRect/>
+                        </a:stretch>
+                      </pic:blipFill>
+                      <pic:spPr>
+                        <a:xfrm>
+                          <a:off x="0" y="0"/>
+                          <a:ext cx="12700" cy="19685"/>
+                        </a:xfrm>
+                        <a:prstGeom prst="rect"/>
+                        <a:ln/>
+                      </pic:spPr>
+                    </pic:pic>
+                  </a:graphicData>
+                </a:graphic>
+              </wp:inline>
+            </w:drawing>
+          </mc:Fallback>
+        </mc:AlternateContent>
       </w:r>
       <w:r>
         <w:rPr>
@@ -1436,9 +1658,10 @@
           <w:ilvl w:val="0"/>
           <w:numId w:val="4"/>
         </w:numPr>
-        <w:spacing w:after="0" w:afterAutospacing="0" w:line="240" w:lineRule="auto"/>
-        <w:ind w:left="283.46456692913375" w:hanging="285"/>
-        <w:jc w:val="both"/>
+        <w:spacing w:after="0" w:before="0" w:line="240" w:lineRule="auto"/>
+        <w:ind w:left="283" w:right="0" w:hanging="285"/>
+        <w:jc w:val="both"/>
+        <w:rPr/>
       </w:pPr>
       <w:r>
         <w:rPr>
@@ -1464,14 +1687,10 @@
         <w:tabs>
           <w:tab w:val="left" w:leader="none" w:pos="1110"/>
         </w:tabs>
-        <w:spacing w:after="0" w:line="240" w:lineRule="auto"/>
-        <w:ind w:left="720" w:hanging="360"/>
-        <w:jc w:val="both"/>
-        <w:rPr>
-          <w:b w:val="1"/>
-          <w:bCs w:val="1"/>
-          <w:highlight w:val="white"/>
-        </w:rPr>
+        <w:spacing w:after="0" w:before="0" w:line="240" w:lineRule="auto"/>
+        <w:ind w:left="720" w:right="0" w:hanging="360"/>
+        <w:jc w:val="both"/>
+        <w:rPr/>
       </w:pPr>
       <w:r>
         <w:rPr>
@@ -1487,14 +1706,10 @@
           <w:ilvl w:val="0"/>
           <w:numId w:val="4"/>
         </w:numPr>
-        <w:spacing w:after="0" w:line="240" w:lineRule="auto"/>
-        <w:ind w:left="720" w:hanging="360"/>
-        <w:jc w:val="both"/>
-        <w:rPr>
-          <w:b w:val="1"/>
-          <w:bCs w:val="1"/>
-          <w:highlight w:val="white"/>
-        </w:rPr>
+        <w:spacing w:after="0" w:before="0" w:line="240" w:lineRule="auto"/>
+        <w:ind w:left="720" w:right="0" w:hanging="360"/>
+        <w:jc w:val="both"/>
+        <w:rPr/>
       </w:pPr>
       <w:r>
         <w:rPr>
@@ -1506,8 +1721,8 @@
     <w:p>
       <w:pPr>
         <w:widowControl w:val="0"/>
-        <w:spacing w:after="0" w:line="240" w:lineRule="auto"/>
-        <w:ind w:left="0" w:firstLine="0"/>
+        <w:spacing w:after="0" w:before="0" w:line="240" w:lineRule="auto"/>
+        <w:ind w:left="0" w:right="0" w:firstLine="0"/>
         <w:jc w:val="both"/>
         <w:rPr/>
       </w:pPr>
@@ -1533,9 +1748,90 @@
         <w:t xml:space="preserve">CERTIFICATIONS</w:t>
       </w:r>
       <w:r>
-        <w:pict>
-          <v:rect style="width:0.0pt;height:1.5pt" o:hr="t" o:hrstd="t" o:hralign="center" fillcolor="#A0A0A0" stroked="f"/>
-        </w:pict>
+        <w:rPr/>
+        <mc:AlternateContent>
+          <mc:Choice Requires="wpg">
+            <w:drawing>
+              <wp:inline distB="0" distT="0" distL="114300" distR="114300">
+                <wp:extent cx="12700" cy="19685"/>
+                <wp:effectExtent b="0" l="0" r="0" t="0"/>
+                <wp:docPr id="5" name=""/>
+                <a:graphic>
+                  <a:graphicData uri="http://schemas.microsoft.com/office/word/2010/wordprocessingShape">
+                    <wps:wsp>
+                      <wps:cNvSpPr/>
+                      <wps:cNvPr id="6" name="Shape 6"/>
+                      <wps:spPr>
+                        <a:xfrm>
+                          <a:off x="5345640" y="3770460"/>
+                          <a:ext cx="720" cy="19080"/>
+                        </a:xfrm>
+                        <a:prstGeom prst="rect">
+                          <a:avLst/>
+                        </a:prstGeom>
+                        <a:solidFill>
+                          <a:srgbClr val="A0A0A0"/>
+                        </a:solidFill>
+                        <a:ln>
+                          <a:noFill/>
+                        </a:ln>
+                      </wps:spPr>
+                      <wps:txbx>
+                        <w:txbxContent>
+                          <w:p>
+                            <w:pPr>
+                              <w:spacing w:after="0" w:before="0" w:line="240"/>
+                              <w:ind w:left="0" w:right="0" w:firstLine="0"/>
+                              <w:jc w:val="left"/>
+                              <w:textDirection w:val="btLr"/>
+                            </w:pPr>
+                          </w:p>
+                        </w:txbxContent>
+                      </wps:txbx>
+                      <wps:bodyPr anchorCtr="0" anchor="ctr" bIns="91425" lIns="91425" spcFirstLastPara="1" rIns="91425" wrap="square" tIns="91425">
+                        <a:noAutofit/>
+                      </wps:bodyPr>
+                    </wps:wsp>
+                  </a:graphicData>
+                </a:graphic>
+              </wp:inline>
+            </w:drawing>
+          </mc:Choice>
+          <mc:Fallback>
+            <w:drawing>
+              <wp:inline distB="0" distT="0" distL="114300" distR="114300">
+                <wp:extent cx="12700" cy="19685"/>
+                <wp:effectExtent b="0" l="0" r="0" t="0"/>
+                <wp:docPr id="5" name="image5.png"/>
+                <a:graphic>
+                  <a:graphicData uri="http://schemas.openxmlformats.org/drawingml/2006/picture">
+                    <pic:pic>
+                      <pic:nvPicPr>
+                        <pic:cNvPr id="0" name="image5.png"/>
+                        <pic:cNvPicPr preferRelativeResize="0"/>
+                      </pic:nvPicPr>
+                      <pic:blipFill>
+                        <a:blip r:embed="rId6"/>
+                        <a:srcRect/>
+                        <a:stretch>
+                          <a:fillRect/>
+                        </a:stretch>
+                      </pic:blipFill>
+                      <pic:spPr>
+                        <a:xfrm>
+                          <a:off x="0" y="0"/>
+                          <a:ext cx="12700" cy="19685"/>
+                        </a:xfrm>
+                        <a:prstGeom prst="rect"/>
+                        <a:ln/>
+                      </pic:spPr>
+                    </pic:pic>
+                  </a:graphicData>
+                </a:graphic>
+              </wp:inline>
+            </w:drawing>
+          </mc:Fallback>
+        </mc:AlternateContent>
       </w:r>
       <w:r>
         <w:rPr>
@@ -1549,12 +1845,12 @@
           <w:ilvl w:val="0"/>
           <w:numId w:val="4"/>
         </w:numPr>
-        <w:spacing w:after="0" w:afterAutospacing="0" w:line="240" w:lineRule="auto"/>
-        <w:ind w:left="283.46456692913375" w:hanging="285"/>
-        <w:jc w:val="both"/>
-        <w:rPr/>
-      </w:pPr>
-      <w:hyperlink r:id="rId12">
+        <w:spacing w:after="0" w:before="0" w:line="240" w:lineRule="auto"/>
+        <w:ind w:left="283" w:right="0" w:hanging="285"/>
+        <w:jc w:val="both"/>
+        <w:rPr/>
+      </w:pPr>
+      <w:hyperlink r:id="rId13">
         <w:r>
           <w:rPr>
             <w:color w:val="1155cc"/>
@@ -1565,7 +1861,7 @@
           <w:t xml:space="preserve">LPIC-1</w:t>
         </w:r>
       </w:hyperlink>
-      <w:hyperlink r:id="rId13">
+      <w:hyperlink r:id="rId14">
         <w:r>
           <w:rPr>
             <w:color w:val="1155cc"/>
@@ -1575,7 +1871,7 @@
           <w:t xml:space="preserve"> / </w:t>
         </w:r>
       </w:hyperlink>
-      <w:hyperlink r:id="rId14">
+      <w:hyperlink r:id="rId15">
         <w:r>
           <w:rPr>
             <w:color w:val="1155cc"/>
@@ -1599,14 +1895,11 @@
           <w:numId w:val="4"/>
         </w:numPr>
         <w:spacing w:line="240" w:lineRule="auto"/>
-        <w:ind w:left="283.46456692913375" w:hanging="285"/>
-        <w:jc w:val="both"/>
-        <w:rPr>
-          <w:highlight w:val="white"/>
-          <w:u w:val="none"/>
-        </w:rPr>
-      </w:pPr>
-      <w:hyperlink r:id="rId15">
+        <w:ind w:left="283" w:right="0" w:hanging="285"/>
+        <w:jc w:val="both"/>
+        <w:rPr/>
+      </w:pPr>
+      <w:hyperlink r:id="rId16">
         <w:r>
           <w:rPr>
             <w:color w:val="1155cc"/>
@@ -1625,20 +1918,6 @@
     </w:p>
     <w:p>
       <w:pPr>
-        <w:spacing w:line="240" w:lineRule="auto"/>
-        <w:jc w:val="both"/>
-        <w:rPr>
-          <w:highlight w:val="white"/>
-        </w:rPr>
-      </w:pPr>
-      <w:r>
-        <w:rPr>
-          <w:rtl w:val="0"/>
-        </w:rPr>
-      </w:r>
-    </w:p>
-    <w:p>
-      <w:pPr>
         <w:jc w:val="both"/>
         <w:rPr/>
       </w:pPr>
@@ -1653,18 +1932,100 @@
         <w:t xml:space="preserve">LANGUAGES</w:t>
       </w:r>
       <w:r>
-        <w:pict>
-          <v:rect style="width:0.0pt;height:1.5pt" o:hr="t" o:hrstd="t" o:hralign="center" fillcolor="#A0A0A0" stroked="f"/>
-        </w:pict>
-      </w:r>
-      <w:r>
-        <w:rPr>
-          <w:rtl w:val="0"/>
-        </w:rPr>
-      </w:r>
-    </w:p>
-    <w:p>
-      <w:pPr>
+        <w:rPr/>
+        <mc:AlternateContent>
+          <mc:Choice Requires="wpg">
+            <w:drawing>
+              <wp:inline distB="0" distT="0" distL="114300" distR="114300">
+                <wp:extent cx="12700" cy="19685"/>
+                <wp:effectExtent b="0" l="0" r="0" t="0"/>
+                <wp:docPr id="7" name=""/>
+                <a:graphic>
+                  <a:graphicData uri="http://schemas.microsoft.com/office/word/2010/wordprocessingShape">
+                    <wps:wsp>
+                      <wps:cNvSpPr/>
+                      <wps:cNvPr id="8" name="Shape 8"/>
+                      <wps:spPr>
+                        <a:xfrm>
+                          <a:off x="5345640" y="3770460"/>
+                          <a:ext cx="720" cy="19080"/>
+                        </a:xfrm>
+                        <a:prstGeom prst="rect">
+                          <a:avLst/>
+                        </a:prstGeom>
+                        <a:solidFill>
+                          <a:srgbClr val="A0A0A0"/>
+                        </a:solidFill>
+                        <a:ln>
+                          <a:noFill/>
+                        </a:ln>
+                      </wps:spPr>
+                      <wps:txbx>
+                        <w:txbxContent>
+                          <w:p>
+                            <w:pPr>
+                              <w:spacing w:after="0" w:before="0" w:line="240"/>
+                              <w:ind w:left="0" w:right="0" w:firstLine="0"/>
+                              <w:jc w:val="left"/>
+                              <w:textDirection w:val="btLr"/>
+                            </w:pPr>
+                          </w:p>
+                        </w:txbxContent>
+                      </wps:txbx>
+                      <wps:bodyPr anchorCtr="0" anchor="ctr" bIns="91425" lIns="91425" spcFirstLastPara="1" rIns="91425" wrap="square" tIns="91425">
+                        <a:noAutofit/>
+                      </wps:bodyPr>
+                    </wps:wsp>
+                  </a:graphicData>
+                </a:graphic>
+              </wp:inline>
+            </w:drawing>
+          </mc:Choice>
+          <mc:Fallback>
+            <w:drawing>
+              <wp:inline distB="0" distT="0" distL="114300" distR="114300">
+                <wp:extent cx="12700" cy="19685"/>
+                <wp:effectExtent b="0" l="0" r="0" t="0"/>
+                <wp:docPr id="7" name="image7.png"/>
+                <a:graphic>
+                  <a:graphicData uri="http://schemas.openxmlformats.org/drawingml/2006/picture">
+                    <pic:pic>
+                      <pic:nvPicPr>
+                        <pic:cNvPr id="0" name="image7.png"/>
+                        <pic:cNvPicPr preferRelativeResize="0"/>
+                      </pic:nvPicPr>
+                      <pic:blipFill>
+                        <a:blip r:embed="rId6"/>
+                        <a:srcRect/>
+                        <a:stretch>
+                          <a:fillRect/>
+                        </a:stretch>
+                      </pic:blipFill>
+                      <pic:spPr>
+                        <a:xfrm>
+                          <a:off x="0" y="0"/>
+                          <a:ext cx="12700" cy="19685"/>
+                        </a:xfrm>
+                        <a:prstGeom prst="rect"/>
+                        <a:ln/>
+                      </pic:spPr>
+                    </pic:pic>
+                  </a:graphicData>
+                </a:graphic>
+              </wp:inline>
+            </w:drawing>
+          </mc:Fallback>
+        </mc:AlternateContent>
+      </w:r>
+      <w:r>
+        <w:rPr>
+          <w:rtl w:val="0"/>
+        </w:rPr>
+      </w:r>
+    </w:p>
+    <w:p>
+      <w:pPr>
+        <w:spacing w:after="200" w:before="0" w:lineRule="auto"/>
         <w:jc w:val="both"/>
         <w:rPr/>
       </w:pPr>
@@ -1678,15 +2039,10 @@
         <w:br w:type="textWrapping"/>
         <w:t xml:space="preserve">Serbian - A2 (Elementary)</w:t>
       </w:r>
-      <w:r>
-        <w:rPr>
-          <w:rtl w:val="0"/>
-        </w:rPr>
-      </w:r>
     </w:p>
     <w:sectPr>
       <w:pgSz w:h="15840" w:w="12240" w:orient="portrait"/>
-      <w:pgMar w:bottom="1440" w:top="1440" w:left="1800" w:right="1800" w:header="720" w:footer="720"/>
+      <w:pgMar w:bottom="1440" w:top="1440" w:left="1800" w:right="1800" w:header="0" w:footer="0"/>
       <w:pgNumType w:start="1"/>
     </w:sectPr>
   </w:body>
@@ -1705,18 +2061,20 @@
         <w:ind w:left="720" w:hanging="360"/>
       </w:pPr>
       <w:rPr>
+        <w:rFonts w:ascii="Noto Sans Symbols" w:cs="Noto Sans Symbols" w:eastAsia="Noto Sans Symbols" w:hAnsi="Noto Sans Symbols"/>
         <w:u w:val="none"/>
       </w:rPr>
     </w:lvl>
     <w:lvl w:ilvl="1">
       <w:start w:val="1"/>
       <w:numFmt w:val="bullet"/>
-      <w:lvlText w:val="○"/>
+      <w:lvlText w:val="🌕"/>
       <w:lvlJc w:val="left"/>
       <w:pPr>
         <w:ind w:left="1440" w:hanging="360"/>
       </w:pPr>
       <w:rPr>
+        <w:rFonts w:ascii="Noto Sans Symbols" w:cs="Noto Sans Symbols" w:eastAsia="Noto Sans Symbols" w:hAnsi="Noto Sans Symbols"/>
         <w:u w:val="none"/>
       </w:rPr>
     </w:lvl>
@@ -1729,6 +2087,7 @@
         <w:ind w:left="2160" w:hanging="360"/>
       </w:pPr>
       <w:rPr>
+        <w:rFonts w:ascii="Noto Sans Symbols" w:cs="Noto Sans Symbols" w:eastAsia="Noto Sans Symbols" w:hAnsi="Noto Sans Symbols"/>
         <w:u w:val="none"/>
       </w:rPr>
     </w:lvl>
@@ -1741,18 +2100,20 @@
         <w:ind w:left="2880" w:hanging="360"/>
       </w:pPr>
       <w:rPr>
+        <w:rFonts w:ascii="Noto Sans Symbols" w:cs="Noto Sans Symbols" w:eastAsia="Noto Sans Symbols" w:hAnsi="Noto Sans Symbols"/>
         <w:u w:val="none"/>
       </w:rPr>
     </w:lvl>
     <w:lvl w:ilvl="4">
       <w:start w:val="1"/>
       <w:numFmt w:val="bullet"/>
-      <w:lvlText w:val="○"/>
+      <w:lvlText w:val="🌕"/>
       <w:lvlJc w:val="left"/>
       <w:pPr>
         <w:ind w:left="3600" w:hanging="360"/>
       </w:pPr>
       <w:rPr>
+        <w:rFonts w:ascii="Noto Sans Symbols" w:cs="Noto Sans Symbols" w:eastAsia="Noto Sans Symbols" w:hAnsi="Noto Sans Symbols"/>
         <w:u w:val="none"/>
       </w:rPr>
     </w:lvl>
@@ -1765,6 +2126,7 @@
         <w:ind w:left="4320" w:hanging="360"/>
       </w:pPr>
       <w:rPr>
+        <w:rFonts w:ascii="Noto Sans Symbols" w:cs="Noto Sans Symbols" w:eastAsia="Noto Sans Symbols" w:hAnsi="Noto Sans Symbols"/>
         <w:u w:val="none"/>
       </w:rPr>
     </w:lvl>
@@ -1777,18 +2139,20 @@
         <w:ind w:left="5040" w:hanging="360"/>
       </w:pPr>
       <w:rPr>
+        <w:rFonts w:ascii="Noto Sans Symbols" w:cs="Noto Sans Symbols" w:eastAsia="Noto Sans Symbols" w:hAnsi="Noto Sans Symbols"/>
         <w:u w:val="none"/>
       </w:rPr>
     </w:lvl>
     <w:lvl w:ilvl="7">
       <w:start w:val="1"/>
       <w:numFmt w:val="bullet"/>
-      <w:lvlText w:val="○"/>
+      <w:lvlText w:val="🌕"/>
       <w:lvlJc w:val="left"/>
       <w:pPr>
         <w:ind w:left="5760" w:hanging="360"/>
       </w:pPr>
       <w:rPr>
+        <w:rFonts w:ascii="Noto Sans Symbols" w:cs="Noto Sans Symbols" w:eastAsia="Noto Sans Symbols" w:hAnsi="Noto Sans Symbols"/>
         <w:u w:val="none"/>
       </w:rPr>
     </w:lvl>
@@ -1801,6 +2165,7 @@
         <w:ind w:left="6480" w:hanging="360"/>
       </w:pPr>
       <w:rPr>
+        <w:rFonts w:ascii="Noto Sans Symbols" w:cs="Noto Sans Symbols" w:eastAsia="Noto Sans Symbols" w:hAnsi="Noto Sans Symbols"/>
         <w:u w:val="none"/>
       </w:rPr>
     </w:lvl>
@@ -1815,18 +2180,20 @@
         <w:ind w:left="720" w:hanging="360"/>
       </w:pPr>
       <w:rPr>
+        <w:rFonts w:ascii="Noto Sans Symbols" w:cs="Noto Sans Symbols" w:eastAsia="Noto Sans Symbols" w:hAnsi="Noto Sans Symbols"/>
         <w:u w:val="none"/>
       </w:rPr>
     </w:lvl>
     <w:lvl w:ilvl="1">
       <w:start w:val="1"/>
       <w:numFmt w:val="bullet"/>
-      <w:lvlText w:val="○"/>
+      <w:lvlText w:val="🌕"/>
       <w:lvlJc w:val="left"/>
       <w:pPr>
         <w:ind w:left="1440" w:hanging="360"/>
       </w:pPr>
       <w:rPr>
+        <w:rFonts w:ascii="Noto Sans Symbols" w:cs="Noto Sans Symbols" w:eastAsia="Noto Sans Symbols" w:hAnsi="Noto Sans Symbols"/>
         <w:u w:val="none"/>
       </w:rPr>
     </w:lvl>
@@ -1839,6 +2206,7 @@
         <w:ind w:left="2160" w:hanging="360"/>
       </w:pPr>
       <w:rPr>
+        <w:rFonts w:ascii="Noto Sans Symbols" w:cs="Noto Sans Symbols" w:eastAsia="Noto Sans Symbols" w:hAnsi="Noto Sans Symbols"/>
         <w:u w:val="none"/>
       </w:rPr>
     </w:lvl>
@@ -1851,18 +2219,20 @@
         <w:ind w:left="2880" w:hanging="360"/>
       </w:pPr>
       <w:rPr>
+        <w:rFonts w:ascii="Noto Sans Symbols" w:cs="Noto Sans Symbols" w:eastAsia="Noto Sans Symbols" w:hAnsi="Noto Sans Symbols"/>
         <w:u w:val="none"/>
       </w:rPr>
     </w:lvl>
     <w:lvl w:ilvl="4">
       <w:start w:val="1"/>
       <w:numFmt w:val="bullet"/>
-      <w:lvlText w:val="○"/>
+      <w:lvlText w:val="🌕"/>
       <w:lvlJc w:val="left"/>
       <w:pPr>
         <w:ind w:left="3600" w:hanging="360"/>
       </w:pPr>
       <w:rPr>
+        <w:rFonts w:ascii="Noto Sans Symbols" w:cs="Noto Sans Symbols" w:eastAsia="Noto Sans Symbols" w:hAnsi="Noto Sans Symbols"/>
         <w:u w:val="none"/>
       </w:rPr>
     </w:lvl>
@@ -1875,6 +2245,7 @@
         <w:ind w:left="4320" w:hanging="360"/>
       </w:pPr>
       <w:rPr>
+        <w:rFonts w:ascii="Noto Sans Symbols" w:cs="Noto Sans Symbols" w:eastAsia="Noto Sans Symbols" w:hAnsi="Noto Sans Symbols"/>
         <w:u w:val="none"/>
       </w:rPr>
     </w:lvl>
@@ -1887,18 +2258,20 @@
         <w:ind w:left="5040" w:hanging="360"/>
       </w:pPr>
       <w:rPr>
+        <w:rFonts w:ascii="Noto Sans Symbols" w:cs="Noto Sans Symbols" w:eastAsia="Noto Sans Symbols" w:hAnsi="Noto Sans Symbols"/>
         <w:u w:val="none"/>
       </w:rPr>
     </w:lvl>
     <w:lvl w:ilvl="7">
       <w:start w:val="1"/>
       <w:numFmt w:val="bullet"/>
-      <w:lvlText w:val="○"/>
+      <w:lvlText w:val="🌕"/>
       <w:lvlJc w:val="left"/>
       <w:pPr>
         <w:ind w:left="5760" w:hanging="360"/>
       </w:pPr>
       <w:rPr>
+        <w:rFonts w:ascii="Noto Sans Symbols" w:cs="Noto Sans Symbols" w:eastAsia="Noto Sans Symbols" w:hAnsi="Noto Sans Symbols"/>
         <w:u w:val="none"/>
       </w:rPr>
     </w:lvl>
@@ -1911,6 +2284,7 @@
         <w:ind w:left="6480" w:hanging="360"/>
       </w:pPr>
       <w:rPr>
+        <w:rFonts w:ascii="Noto Sans Symbols" w:cs="Noto Sans Symbols" w:eastAsia="Noto Sans Symbols" w:hAnsi="Noto Sans Symbols"/>
         <w:u w:val="none"/>
       </w:rPr>
     </w:lvl>
@@ -1925,18 +2299,20 @@
         <w:ind w:left="720" w:hanging="360"/>
       </w:pPr>
       <w:rPr>
+        <w:rFonts w:ascii="Noto Sans Symbols" w:cs="Noto Sans Symbols" w:eastAsia="Noto Sans Symbols" w:hAnsi="Noto Sans Symbols"/>
         <w:u w:val="none"/>
       </w:rPr>
     </w:lvl>
     <w:lvl w:ilvl="1">
       <w:start w:val="1"/>
       <w:numFmt w:val="bullet"/>
-      <w:lvlText w:val="○"/>
+      <w:lvlText w:val="🌕"/>
       <w:lvlJc w:val="left"/>
       <w:pPr>
         <w:ind w:left="1440" w:hanging="360"/>
       </w:pPr>
       <w:rPr>
+        <w:rFonts w:ascii="Noto Sans Symbols" w:cs="Noto Sans Symbols" w:eastAsia="Noto Sans Symbols" w:hAnsi="Noto Sans Symbols"/>
         <w:u w:val="none"/>
       </w:rPr>
     </w:lvl>
@@ -1949,6 +2325,7 @@
         <w:ind w:left="2160" w:hanging="360"/>
       </w:pPr>
       <w:rPr>
+        <w:rFonts w:ascii="Noto Sans Symbols" w:cs="Noto Sans Symbols" w:eastAsia="Noto Sans Symbols" w:hAnsi="Noto Sans Symbols"/>
         <w:u w:val="none"/>
       </w:rPr>
     </w:lvl>
@@ -1961,18 +2338,20 @@
         <w:ind w:left="2880" w:hanging="360"/>
       </w:pPr>
       <w:rPr>
+        <w:rFonts w:ascii="Noto Sans Symbols" w:cs="Noto Sans Symbols" w:eastAsia="Noto Sans Symbols" w:hAnsi="Noto Sans Symbols"/>
         <w:u w:val="none"/>
       </w:rPr>
     </w:lvl>
     <w:lvl w:ilvl="4">
       <w:start w:val="1"/>
       <w:numFmt w:val="bullet"/>
-      <w:lvlText w:val="○"/>
+      <w:lvlText w:val="🌕"/>
       <w:lvlJc w:val="left"/>
       <w:pPr>
         <w:ind w:left="3600" w:hanging="360"/>
       </w:pPr>
       <w:rPr>
+        <w:rFonts w:ascii="Noto Sans Symbols" w:cs="Noto Sans Symbols" w:eastAsia="Noto Sans Symbols" w:hAnsi="Noto Sans Symbols"/>
         <w:u w:val="none"/>
       </w:rPr>
     </w:lvl>
@@ -1985,6 +2364,7 @@
         <w:ind w:left="4320" w:hanging="360"/>
       </w:pPr>
       <w:rPr>
+        <w:rFonts w:ascii="Noto Sans Symbols" w:cs="Noto Sans Symbols" w:eastAsia="Noto Sans Symbols" w:hAnsi="Noto Sans Symbols"/>
         <w:u w:val="none"/>
       </w:rPr>
     </w:lvl>
@@ -1997,18 +2377,20 @@
         <w:ind w:left="5040" w:hanging="360"/>
       </w:pPr>
       <w:rPr>
+        <w:rFonts w:ascii="Noto Sans Symbols" w:cs="Noto Sans Symbols" w:eastAsia="Noto Sans Symbols" w:hAnsi="Noto Sans Symbols"/>
         <w:u w:val="none"/>
       </w:rPr>
     </w:lvl>
     <w:lvl w:ilvl="7">
       <w:start w:val="1"/>
       <w:numFmt w:val="bullet"/>
-      <w:lvlText w:val="○"/>
+      <w:lvlText w:val="🌕"/>
       <w:lvlJc w:val="left"/>
       <w:pPr>
         <w:ind w:left="5760" w:hanging="360"/>
       </w:pPr>
       <w:rPr>
+        <w:rFonts w:ascii="Noto Sans Symbols" w:cs="Noto Sans Symbols" w:eastAsia="Noto Sans Symbols" w:hAnsi="Noto Sans Symbols"/>
         <w:u w:val="none"/>
       </w:rPr>
     </w:lvl>
@@ -2021,6 +2403,7 @@
         <w:ind w:left="6480" w:hanging="360"/>
       </w:pPr>
       <w:rPr>
+        <w:rFonts w:ascii="Noto Sans Symbols" w:cs="Noto Sans Symbols" w:eastAsia="Noto Sans Symbols" w:hAnsi="Noto Sans Symbols"/>
         <w:u w:val="none"/>
       </w:rPr>
     </w:lvl>
@@ -2035,6 +2418,9 @@
         <w:ind w:left="720" w:hanging="360"/>
       </w:pPr>
       <w:rPr>
+        <w:rFonts w:ascii="Noto Sans Symbols" w:cs="Noto Sans Symbols" w:eastAsia="Noto Sans Symbols" w:hAnsi="Noto Sans Symbols"/>
+        <w:b w:val="1"/>
+        <w:bCs w:val="1"/>
         <w:u w:val="none"/>
       </w:rPr>
     </w:lvl>
@@ -2047,6 +2433,7 @@
         <w:ind w:left="1440" w:hanging="360"/>
       </w:pPr>
       <w:rPr>
+        <w:rFonts w:ascii="Noto Sans Symbols" w:cs="Noto Sans Symbols" w:eastAsia="Noto Sans Symbols" w:hAnsi="Noto Sans Symbols"/>
         <w:u w:val="none"/>
       </w:rPr>
     </w:lvl>
@@ -2059,6 +2446,7 @@
         <w:ind w:left="2160" w:hanging="360"/>
       </w:pPr>
       <w:rPr>
+        <w:rFonts w:ascii="Noto Sans Symbols" w:cs="Noto Sans Symbols" w:eastAsia="Noto Sans Symbols" w:hAnsi="Noto Sans Symbols"/>
         <w:u w:val="none"/>
       </w:rPr>
     </w:lvl>
@@ -2071,6 +2459,7 @@
         <w:ind w:left="2880" w:hanging="360"/>
       </w:pPr>
       <w:rPr>
+        <w:rFonts w:ascii="Noto Sans Symbols" w:cs="Noto Sans Symbols" w:eastAsia="Noto Sans Symbols" w:hAnsi="Noto Sans Symbols"/>
         <w:u w:val="none"/>
       </w:rPr>
     </w:lvl>
@@ -2083,6 +2472,7 @@
         <w:ind w:left="3600" w:hanging="360"/>
       </w:pPr>
       <w:rPr>
+        <w:rFonts w:ascii="Noto Sans Symbols" w:cs="Noto Sans Symbols" w:eastAsia="Noto Sans Symbols" w:hAnsi="Noto Sans Symbols"/>
         <w:u w:val="none"/>
       </w:rPr>
     </w:lvl>
@@ -2095,6 +2485,7 @@
         <w:ind w:left="4320" w:hanging="360"/>
       </w:pPr>
       <w:rPr>
+        <w:rFonts w:ascii="Noto Sans Symbols" w:cs="Noto Sans Symbols" w:eastAsia="Noto Sans Symbols" w:hAnsi="Noto Sans Symbols"/>
         <w:u w:val="none"/>
       </w:rPr>
     </w:lvl>
@@ -2107,6 +2498,7 @@
         <w:ind w:left="5040" w:hanging="360"/>
       </w:pPr>
       <w:rPr>
+        <w:rFonts w:ascii="Noto Sans Symbols" w:cs="Noto Sans Symbols" w:eastAsia="Noto Sans Symbols" w:hAnsi="Noto Sans Symbols"/>
         <w:u w:val="none"/>
       </w:rPr>
     </w:lvl>
@@ -2119,6 +2511,7 @@
         <w:ind w:left="5760" w:hanging="360"/>
       </w:pPr>
       <w:rPr>
+        <w:rFonts w:ascii="Noto Sans Symbols" w:cs="Noto Sans Symbols" w:eastAsia="Noto Sans Symbols" w:hAnsi="Noto Sans Symbols"/>
         <w:u w:val="none"/>
       </w:rPr>
     </w:lvl>
@@ -2131,6 +2524,7 @@
         <w:ind w:left="6480" w:hanging="360"/>
       </w:pPr>
       <w:rPr>
+        <w:rFonts w:ascii="Noto Sans Symbols" w:cs="Noto Sans Symbols" w:eastAsia="Noto Sans Symbols" w:hAnsi="Noto Sans Symbols"/>
         <w:u w:val="none"/>
       </w:rPr>
     </w:lvl>
@@ -2158,11 +2552,12 @@
         <w:rFonts w:ascii="Cambria" w:cs="Cambria" w:eastAsia="Cambria" w:hAnsi="Cambria"/>
         <w:sz w:val="22"/>
         <w:szCs w:val="22"/>
-        <w:lang w:val="en-US"/>
+        <w:lang w:val="en"/>
       </w:rPr>
     </w:rPrDefault>
     <w:pPrDefault>
       <w:pPr>
+        <w:widowControl w:val="0"/>
         <w:spacing w:after="200" w:line="276" w:lineRule="auto"/>
       </w:pPr>
     </w:pPrDefault>
@@ -2188,15 +2583,34 @@
     <w:pPr>
       <w:keepNext w:val="1"/>
       <w:keepLines w:val="1"/>
-      <w:spacing w:after="0" w:before="480" w:lineRule="auto"/>
+      <w:pageBreakBefore w:val="0"/>
+      <w:widowControl w:val="1"/>
+      <w:pBdr>
+        <w:top w:space="0" w:sz="0" w:val="nil"/>
+        <w:left w:space="0" w:sz="0" w:val="nil"/>
+        <w:bottom w:space="0" w:sz="0" w:val="nil"/>
+        <w:right w:space="0" w:sz="0" w:val="nil"/>
+        <w:between w:space="0" w:sz="0" w:val="nil"/>
+      </w:pBdr>
+      <w:shd w:fill="auto" w:val="clear"/>
+      <w:spacing w:after="0" w:before="480" w:line="240" w:lineRule="auto"/>
+      <w:ind w:left="0" w:right="0" w:firstLine="0"/>
+      <w:jc w:val="left"/>
     </w:pPr>
     <w:rPr>
       <w:rFonts w:ascii="Calibri" w:cs="Calibri" w:eastAsia="Calibri" w:hAnsi="Calibri"/>
       <w:b w:val="1"/>
       <w:bCs w:val="1"/>
+      <w:i w:val="0"/>
+      <w:iCs w:val="0"/>
+      <w:smallCaps w:val="0"/>
+      <w:strike w:val="0"/>
       <w:color w:val="366091"/>
       <w:sz w:val="28"/>
       <w:szCs w:val="28"/>
+      <w:u w:val="none"/>
+      <w:shd w:fill="auto" w:val="clear"/>
+      <w:vertAlign w:val="baseline"/>
     </w:rPr>
   </w:style>
   <w:style w:type="paragraph" w:styleId="Heading2">
@@ -2206,15 +2620,34 @@
     <w:pPr>
       <w:keepNext w:val="1"/>
       <w:keepLines w:val="1"/>
-      <w:spacing w:after="0" w:before="200" w:lineRule="auto"/>
+      <w:pageBreakBefore w:val="0"/>
+      <w:widowControl w:val="1"/>
+      <w:pBdr>
+        <w:top w:space="0" w:sz="0" w:val="nil"/>
+        <w:left w:space="0" w:sz="0" w:val="nil"/>
+        <w:bottom w:space="0" w:sz="0" w:val="nil"/>
+        <w:right w:space="0" w:sz="0" w:val="nil"/>
+        <w:between w:space="0" w:sz="0" w:val="nil"/>
+      </w:pBdr>
+      <w:shd w:fill="auto" w:val="clear"/>
+      <w:spacing w:after="0" w:before="200" w:line="240" w:lineRule="auto"/>
+      <w:ind w:left="0" w:right="0" w:firstLine="0"/>
+      <w:jc w:val="left"/>
     </w:pPr>
     <w:rPr>
       <w:rFonts w:ascii="Calibri" w:cs="Calibri" w:eastAsia="Calibri" w:hAnsi="Calibri"/>
       <w:b w:val="1"/>
       <w:bCs w:val="1"/>
+      <w:i w:val="0"/>
+      <w:iCs w:val="0"/>
+      <w:smallCaps w:val="0"/>
+      <w:strike w:val="0"/>
       <w:color w:val="4f81bd"/>
       <w:sz w:val="26"/>
       <w:szCs w:val="26"/>
+      <w:u w:val="none"/>
+      <w:shd w:fill="auto" w:val="clear"/>
+      <w:vertAlign w:val="baseline"/>
     </w:rPr>
   </w:style>
   <w:style w:type="paragraph" w:styleId="Heading3">
@@ -2224,13 +2657,34 @@
     <w:pPr>
       <w:keepNext w:val="1"/>
       <w:keepLines w:val="1"/>
-      <w:spacing w:after="0" w:before="200" w:lineRule="auto"/>
+      <w:pageBreakBefore w:val="0"/>
+      <w:widowControl w:val="1"/>
+      <w:pBdr>
+        <w:top w:space="0" w:sz="0" w:val="nil"/>
+        <w:left w:space="0" w:sz="0" w:val="nil"/>
+        <w:bottom w:space="0" w:sz="0" w:val="nil"/>
+        <w:right w:space="0" w:sz="0" w:val="nil"/>
+        <w:between w:space="0" w:sz="0" w:val="nil"/>
+      </w:pBdr>
+      <w:shd w:fill="auto" w:val="clear"/>
+      <w:spacing w:after="0" w:before="200" w:line="240" w:lineRule="auto"/>
+      <w:ind w:left="0" w:right="0" w:firstLine="0"/>
+      <w:jc w:val="left"/>
     </w:pPr>
     <w:rPr>
       <w:rFonts w:ascii="Calibri" w:cs="Calibri" w:eastAsia="Calibri" w:hAnsi="Calibri"/>
       <w:b w:val="1"/>
       <w:bCs w:val="1"/>
+      <w:i w:val="0"/>
+      <w:iCs w:val="0"/>
+      <w:smallCaps w:val="0"/>
+      <w:strike w:val="0"/>
       <w:color w:val="4f81bd"/>
+      <w:sz w:val="22"/>
+      <w:szCs w:val="22"/>
+      <w:u w:val="none"/>
+      <w:shd w:fill="auto" w:val="clear"/>
+      <w:vertAlign w:val="baseline"/>
     </w:rPr>
   </w:style>
   <w:style w:type="paragraph" w:styleId="Heading4">
@@ -2240,7 +2694,19 @@
     <w:pPr>
       <w:keepNext w:val="1"/>
       <w:keepLines w:val="1"/>
-      <w:spacing w:after="0" w:before="200" w:lineRule="auto"/>
+      <w:pageBreakBefore w:val="0"/>
+      <w:widowControl w:val="1"/>
+      <w:pBdr>
+        <w:top w:space="0" w:sz="0" w:val="nil"/>
+        <w:left w:space="0" w:sz="0" w:val="nil"/>
+        <w:bottom w:space="0" w:sz="0" w:val="nil"/>
+        <w:right w:space="0" w:sz="0" w:val="nil"/>
+        <w:between w:space="0" w:sz="0" w:val="nil"/>
+      </w:pBdr>
+      <w:shd w:fill="auto" w:val="clear"/>
+      <w:spacing w:after="0" w:before="200" w:line="240" w:lineRule="auto"/>
+      <w:ind w:left="0" w:right="0" w:firstLine="0"/>
+      <w:jc w:val="left"/>
     </w:pPr>
     <w:rPr>
       <w:rFonts w:ascii="Calibri" w:cs="Calibri" w:eastAsia="Calibri" w:hAnsi="Calibri"/>
@@ -2248,7 +2714,14 @@
       <w:bCs w:val="1"/>
       <w:i w:val="1"/>
       <w:iCs w:val="1"/>
+      <w:smallCaps w:val="0"/>
+      <w:strike w:val="0"/>
       <w:color w:val="4f81bd"/>
+      <w:sz w:val="22"/>
+      <w:szCs w:val="22"/>
+      <w:u w:val="none"/>
+      <w:shd w:fill="auto" w:val="clear"/>
+      <w:vertAlign w:val="baseline"/>
     </w:rPr>
   </w:style>
   <w:style w:type="paragraph" w:styleId="Heading5">
@@ -2258,11 +2731,34 @@
     <w:pPr>
       <w:keepNext w:val="1"/>
       <w:keepLines w:val="1"/>
-      <w:spacing w:after="0" w:before="200" w:lineRule="auto"/>
+      <w:pageBreakBefore w:val="0"/>
+      <w:widowControl w:val="1"/>
+      <w:pBdr>
+        <w:top w:space="0" w:sz="0" w:val="nil"/>
+        <w:left w:space="0" w:sz="0" w:val="nil"/>
+        <w:bottom w:space="0" w:sz="0" w:val="nil"/>
+        <w:right w:space="0" w:sz="0" w:val="nil"/>
+        <w:between w:space="0" w:sz="0" w:val="nil"/>
+      </w:pBdr>
+      <w:shd w:fill="auto" w:val="clear"/>
+      <w:spacing w:after="0" w:before="200" w:line="240" w:lineRule="auto"/>
+      <w:ind w:left="0" w:right="0" w:firstLine="0"/>
+      <w:jc w:val="left"/>
     </w:pPr>
     <w:rPr>
       <w:rFonts w:ascii="Calibri" w:cs="Calibri" w:eastAsia="Calibri" w:hAnsi="Calibri"/>
+      <w:b w:val="0"/>
+      <w:bCs w:val="0"/>
+      <w:i w:val="0"/>
+      <w:iCs w:val="0"/>
+      <w:smallCaps w:val="0"/>
+      <w:strike w:val="0"/>
       <w:color w:val="243f61"/>
+      <w:sz w:val="22"/>
+      <w:szCs w:val="22"/>
+      <w:u w:val="none"/>
+      <w:shd w:fill="auto" w:val="clear"/>
+      <w:vertAlign w:val="baseline"/>
     </w:rPr>
   </w:style>
   <w:style w:type="paragraph" w:styleId="Heading6">
@@ -2272,13 +2768,34 @@
     <w:pPr>
       <w:keepNext w:val="1"/>
       <w:keepLines w:val="1"/>
-      <w:spacing w:after="0" w:before="200" w:lineRule="auto"/>
+      <w:pageBreakBefore w:val="0"/>
+      <w:widowControl w:val="1"/>
+      <w:pBdr>
+        <w:top w:space="0" w:sz="0" w:val="nil"/>
+        <w:left w:space="0" w:sz="0" w:val="nil"/>
+        <w:bottom w:space="0" w:sz="0" w:val="nil"/>
+        <w:right w:space="0" w:sz="0" w:val="nil"/>
+        <w:between w:space="0" w:sz="0" w:val="nil"/>
+      </w:pBdr>
+      <w:shd w:fill="auto" w:val="clear"/>
+      <w:spacing w:after="0" w:before="200" w:line="240" w:lineRule="auto"/>
+      <w:ind w:left="0" w:right="0" w:firstLine="0"/>
+      <w:jc w:val="left"/>
     </w:pPr>
     <w:rPr>
       <w:rFonts w:ascii="Calibri" w:cs="Calibri" w:eastAsia="Calibri" w:hAnsi="Calibri"/>
+      <w:b w:val="0"/>
+      <w:bCs w:val="0"/>
       <w:i w:val="1"/>
       <w:iCs w:val="1"/>
+      <w:smallCaps w:val="0"/>
+      <w:strike w:val="0"/>
       <w:color w:val="243f61"/>
+      <w:sz w:val="22"/>
+      <w:szCs w:val="22"/>
+      <w:u w:val="none"/>
+      <w:shd w:fill="auto" w:val="clear"/>
+      <w:vertAlign w:val="baseline"/>
     </w:rPr>
   </w:style>
   <w:style w:type="paragraph" w:styleId="Title">
@@ -2286,30 +2803,73 @@
     <w:basedOn w:val="Normal"/>
     <w:next w:val="Normal"/>
     <w:pPr>
+      <w:keepNext w:val="0"/>
+      <w:keepLines w:val="0"/>
+      <w:pageBreakBefore w:val="0"/>
+      <w:widowControl w:val="1"/>
       <w:pBdr>
+        <w:top w:space="0" w:sz="0" w:val="nil"/>
+        <w:left w:space="0" w:sz="0" w:val="nil"/>
         <w:bottom w:color="4f81bd" w:space="4" w:sz="8" w:val="single"/>
+        <w:right w:space="0" w:sz="0" w:val="nil"/>
+        <w:between w:space="0" w:sz="0" w:val="nil"/>
       </w:pBdr>
-      <w:spacing w:after="300" w:line="240" w:lineRule="auto"/>
+      <w:shd w:fill="auto" w:val="clear"/>
+      <w:spacing w:after="300" w:before="0" w:line="240" w:lineRule="auto"/>
+      <w:ind w:left="0" w:right="0" w:firstLine="0"/>
+      <w:jc w:val="left"/>
     </w:pPr>
     <w:rPr>
       <w:rFonts w:ascii="Calibri" w:cs="Calibri" w:eastAsia="Calibri" w:hAnsi="Calibri"/>
+      <w:b w:val="0"/>
+      <w:bCs w:val="0"/>
+      <w:i w:val="0"/>
+      <w:iCs w:val="0"/>
+      <w:smallCaps w:val="0"/>
+      <w:strike w:val="0"/>
       <w:color w:val="17365d"/>
       <w:sz w:val="52"/>
       <w:szCs w:val="52"/>
+      <w:u w:val="none"/>
+      <w:shd w:fill="auto" w:val="clear"/>
+      <w:vertAlign w:val="baseline"/>
     </w:rPr>
   </w:style>
   <w:style w:type="paragraph" w:styleId="Subtitle">
     <w:name w:val="Subtitle"/>
     <w:basedOn w:val="Normal"/>
     <w:next w:val="Normal"/>
-    <w:pPr/>
+    <w:pPr>
+      <w:keepNext w:val="0"/>
+      <w:keepLines w:val="0"/>
+      <w:pageBreakBefore w:val="0"/>
+      <w:widowControl w:val="1"/>
+      <w:pBdr>
+        <w:top w:space="0" w:sz="0" w:val="nil"/>
+        <w:left w:space="0" w:sz="0" w:val="nil"/>
+        <w:bottom w:space="0" w:sz="0" w:val="nil"/>
+        <w:right w:space="0" w:sz="0" w:val="nil"/>
+        <w:between w:space="0" w:sz="0" w:val="nil"/>
+      </w:pBdr>
+      <w:shd w:fill="auto" w:val="clear"/>
+      <w:spacing w:after="0" w:before="0" w:line="240" w:lineRule="auto"/>
+      <w:ind w:left="0" w:right="0" w:firstLine="0"/>
+      <w:jc w:val="left"/>
+    </w:pPr>
     <w:rPr>
       <w:rFonts w:ascii="Calibri" w:cs="Calibri" w:eastAsia="Calibri" w:hAnsi="Calibri"/>
+      <w:b w:val="0"/>
+      <w:bCs w:val="0"/>
       <w:i w:val="1"/>
       <w:iCs w:val="1"/>
+      <w:smallCaps w:val="0"/>
+      <w:strike w:val="0"/>
       <w:color w:val="4f81bd"/>
       <w:sz w:val="24"/>
       <w:szCs w:val="24"/>
+      <w:u w:val="none"/>
+      <w:shd w:fill="auto" w:val="clear"/>
+      <w:vertAlign w:val="baseline"/>
     </w:rPr>
   </w:style>
 </w:styles>

</xml_diff>